<commit_message>
feat: add tenant document management feature
- Extend User model to include tenantDocuments relation.
- Create TenantDocument model with necessary fields and relations.
- Implement dossier routes for document management (GET, POST, DELETE).
- Add dossier controller to handle document operations.
- Create dossier service for database interactions related to tenant documents.
- Develop dossier service methods for fetching, uploading, and deleting documents.
- Implement frontend DossierLocatif component for document upload and management.
- Create document categories and specifications for user guidance.
- Add drop zone for file uploads and document status indicators.
- Integrate theme store for dark mode support.
</commit_message>
<xml_diff>
--- a/DA Imooparticuliers.docx
+++ b/DA Imooparticuliers.docx
@@ -7,7 +7,7 @@
         <w:spacing w:before="100" w:beforeAutospacing="1" w:after="100" w:afterAutospacing="1" w:line="240" w:lineRule="auto"/>
         <w:outlineLvl w:val="0"/>
         <w:rPr>
-          <w:rFonts w:ascii="Times New Roman" w:eastAsia="Times New Roman" w:hAnsi="Times New Roman" w:cs="Times New Roman"/>
+          <w:rFonts w:eastAsia="Times New Roman" w:cs="Times New Roman"/>
           <w:b/>
           <w:bCs/>
           <w:kern w:val="36"/>
@@ -32,7 +32,7 @@
       </w:r>
       <w:r>
         <w:rPr>
-          <w:rFonts w:ascii="Times New Roman" w:eastAsia="Times New Roman" w:hAnsi="Times New Roman" w:cs="Times New Roman"/>
+          <w:rFonts w:eastAsia="Times New Roman" w:cs="Times New Roman"/>
           <w:b/>
           <w:bCs/>
           <w:kern w:val="36"/>
@@ -46,7 +46,7 @@
       <w:proofErr w:type="spellStart"/>
       <w:r>
         <w:rPr>
-          <w:rFonts w:ascii="Times New Roman" w:eastAsia="Times New Roman" w:hAnsi="Times New Roman" w:cs="Times New Roman"/>
+          <w:rFonts w:eastAsia="Times New Roman" w:cs="Times New Roman"/>
           <w:b/>
           <w:bCs/>
           <w:kern w:val="36"/>
@@ -63,15 +63,15 @@
       <w:pPr>
         <w:spacing w:before="100" w:beforeAutospacing="1" w:after="100" w:afterAutospacing="1" w:line="240" w:lineRule="auto"/>
         <w:rPr>
-          <w:rFonts w:ascii="Times New Roman" w:eastAsia="Times New Roman" w:hAnsi="Times New Roman" w:cs="Times New Roman"/>
-          <w:kern w:val="0"/>
-          <w:lang w:eastAsia="fr-FR"/>
-          <w14:ligatures w14:val="none"/>
-        </w:rPr>
-      </w:pPr>
-      <w:r>
-        <w:rPr>
-          <w:rFonts w:ascii="Times New Roman" w:eastAsia="Times New Roman" w:hAnsi="Times New Roman" w:cs="Times New Roman"/>
+          <w:rFonts w:eastAsia="Times New Roman" w:cs="Times New Roman"/>
+          <w:kern w:val="0"/>
+          <w:lang w:eastAsia="fr-FR"/>
+          <w14:ligatures w14:val="none"/>
+        </w:rPr>
+      </w:pPr>
+      <w:r>
+        <w:rPr>
+          <w:rFonts w:eastAsia="Times New Roman" w:cs="Times New Roman"/>
           <w:b/>
           <w:bCs/>
           <w:kern w:val="0"/>
@@ -85,15 +85,15 @@
       <w:pPr>
         <w:spacing w:before="100" w:beforeAutospacing="1" w:after="100" w:afterAutospacing="1" w:line="240" w:lineRule="auto"/>
         <w:rPr>
-          <w:rFonts w:ascii="Times New Roman" w:eastAsia="Times New Roman" w:hAnsi="Times New Roman" w:cs="Times New Roman"/>
-          <w:kern w:val="0"/>
-          <w:lang w:eastAsia="fr-FR"/>
-          <w14:ligatures w14:val="none"/>
-        </w:rPr>
-      </w:pPr>
-      <w:r>
-        <w:rPr>
-          <w:rFonts w:ascii="Times New Roman" w:eastAsia="Times New Roman" w:hAnsi="Times New Roman" w:cs="Times New Roman"/>
+          <w:rFonts w:eastAsia="Times New Roman" w:cs="Times New Roman"/>
+          <w:kern w:val="0"/>
+          <w:lang w:eastAsia="fr-FR"/>
+          <w14:ligatures w14:val="none"/>
+        </w:rPr>
+      </w:pPr>
+      <w:r>
+        <w:rPr>
+          <w:rFonts w:eastAsia="Times New Roman" w:cs="Times New Roman"/>
           <w:kern w:val="0"/>
           <w:lang w:eastAsia="fr-FR"/>
           <w14:ligatures w14:val="none"/>
@@ -102,7 +102,7 @@
       </w:r>
       <w:r>
         <w:rPr>
-          <w:rFonts w:ascii="Times New Roman" w:eastAsia="Times New Roman" w:hAnsi="Times New Roman" w:cs="Times New Roman"/>
+          <w:rFonts w:eastAsia="Times New Roman" w:cs="Times New Roman"/>
           <w:b/>
           <w:bCs/>
           <w:kern w:val="0"/>
@@ -113,7 +113,7 @@
       </w:r>
       <w:r>
         <w:rPr>
-          <w:rFonts w:ascii="Times New Roman" w:eastAsia="Times New Roman" w:hAnsi="Times New Roman" w:cs="Times New Roman"/>
+          <w:rFonts w:eastAsia="Times New Roman" w:cs="Times New Roman"/>
           <w:kern w:val="0"/>
           <w:lang w:eastAsia="fr-FR"/>
           <w14:ligatures w14:val="none"/>
@@ -126,7 +126,7 @@
         <w:spacing w:before="100" w:beforeAutospacing="1" w:after="100" w:afterAutospacing="1" w:line="240" w:lineRule="auto"/>
         <w:outlineLvl w:val="1"/>
         <w:rPr>
-          <w:rFonts w:ascii="Times New Roman" w:eastAsia="Times New Roman" w:hAnsi="Times New Roman" w:cs="Times New Roman"/>
+          <w:rFonts w:eastAsia="Times New Roman" w:cs="Times New Roman"/>
           <w:b/>
           <w:bCs/>
           <w:kern w:val="0"/>
@@ -138,7 +138,7 @@
       </w:pPr>
       <w:r>
         <w:rPr>
-          <w:rFonts w:ascii="Times New Roman" w:eastAsia="Times New Roman" w:hAnsi="Times New Roman" w:cs="Times New Roman"/>
+          <w:rFonts w:eastAsia="Times New Roman" w:cs="Times New Roman"/>
           <w:b/>
           <w:bCs/>
           <w:kern w:val="0"/>
@@ -164,7 +164,7 @@
       </w:r>
       <w:r>
         <w:rPr>
-          <w:rFonts w:ascii="Times New Roman" w:eastAsia="Times New Roman" w:hAnsi="Times New Roman" w:cs="Times New Roman"/>
+          <w:rFonts w:eastAsia="Times New Roman" w:cs="Times New Roman"/>
           <w:b/>
           <w:bCs/>
           <w:kern w:val="0"/>
@@ -180,15 +180,15 @@
       <w:pPr>
         <w:spacing w:before="100" w:beforeAutospacing="1" w:after="100" w:afterAutospacing="1" w:line="240" w:lineRule="auto"/>
         <w:rPr>
-          <w:rFonts w:ascii="Times New Roman" w:eastAsia="Times New Roman" w:hAnsi="Times New Roman" w:cs="Times New Roman"/>
-          <w:kern w:val="0"/>
-          <w:lang w:eastAsia="fr-FR"/>
-          <w14:ligatures w14:val="none"/>
-        </w:rPr>
-      </w:pPr>
-      <w:r>
-        <w:rPr>
-          <w:rFonts w:ascii="Times New Roman" w:eastAsia="Times New Roman" w:hAnsi="Times New Roman" w:cs="Times New Roman"/>
+          <w:rFonts w:eastAsia="Times New Roman" w:cs="Times New Roman"/>
+          <w:kern w:val="0"/>
+          <w:lang w:eastAsia="fr-FR"/>
+          <w14:ligatures w14:val="none"/>
+        </w:rPr>
+      </w:pPr>
+      <w:r>
+        <w:rPr>
+          <w:rFonts w:eastAsia="Times New Roman" w:cs="Times New Roman"/>
           <w:kern w:val="0"/>
           <w:lang w:eastAsia="fr-FR"/>
           <w14:ligatures w14:val="none"/>
@@ -204,15 +204,15 @@
         </w:numPr>
         <w:spacing w:before="100" w:beforeAutospacing="1" w:after="100" w:afterAutospacing="1" w:line="240" w:lineRule="auto"/>
         <w:rPr>
-          <w:rFonts w:ascii="Times New Roman" w:eastAsia="Times New Roman" w:hAnsi="Times New Roman" w:cs="Times New Roman"/>
-          <w:kern w:val="0"/>
-          <w:lang w:eastAsia="fr-FR"/>
-          <w14:ligatures w14:val="none"/>
-        </w:rPr>
-      </w:pPr>
-      <w:r>
-        <w:rPr>
-          <w:rFonts w:ascii="Times New Roman" w:eastAsia="Times New Roman" w:hAnsi="Times New Roman" w:cs="Times New Roman"/>
+          <w:rFonts w:eastAsia="Times New Roman" w:cs="Times New Roman"/>
+          <w:kern w:val="0"/>
+          <w:lang w:eastAsia="fr-FR"/>
+          <w14:ligatures w14:val="none"/>
+        </w:rPr>
+      </w:pPr>
+      <w:r>
+        <w:rPr>
+          <w:rFonts w:eastAsia="Times New Roman" w:cs="Times New Roman"/>
           <w:b/>
           <w:bCs/>
           <w:kern w:val="0"/>
@@ -230,15 +230,15 @@
         </w:numPr>
         <w:spacing w:before="100" w:beforeAutospacing="1" w:after="100" w:afterAutospacing="1" w:line="240" w:lineRule="auto"/>
         <w:rPr>
-          <w:rFonts w:ascii="Times New Roman" w:eastAsia="Times New Roman" w:hAnsi="Times New Roman" w:cs="Times New Roman"/>
-          <w:kern w:val="0"/>
-          <w:lang w:eastAsia="fr-FR"/>
-          <w14:ligatures w14:val="none"/>
-        </w:rPr>
-      </w:pPr>
-      <w:r>
-        <w:rPr>
-          <w:rFonts w:ascii="Times New Roman" w:eastAsia="Times New Roman" w:hAnsi="Times New Roman" w:cs="Times New Roman"/>
+          <w:rFonts w:eastAsia="Times New Roman" w:cs="Times New Roman"/>
+          <w:kern w:val="0"/>
+          <w:lang w:eastAsia="fr-FR"/>
+          <w14:ligatures w14:val="none"/>
+        </w:rPr>
+      </w:pPr>
+      <w:r>
+        <w:rPr>
+          <w:rFonts w:eastAsia="Times New Roman" w:cs="Times New Roman"/>
           <w:i/>
           <w:iCs/>
           <w:kern w:val="0"/>
@@ -249,7 +249,7 @@
       </w:r>
       <w:r>
         <w:rPr>
-          <w:rFonts w:ascii="Times New Roman" w:eastAsia="Times New Roman" w:hAnsi="Times New Roman" w:cs="Times New Roman"/>
+          <w:rFonts w:eastAsia="Times New Roman" w:cs="Times New Roman"/>
           <w:kern w:val="0"/>
           <w:lang w:eastAsia="fr-FR"/>
           <w14:ligatures w14:val="none"/>
@@ -265,15 +265,15 @@
         </w:numPr>
         <w:spacing w:before="100" w:beforeAutospacing="1" w:after="100" w:afterAutospacing="1" w:line="240" w:lineRule="auto"/>
         <w:rPr>
-          <w:rFonts w:ascii="Times New Roman" w:eastAsia="Times New Roman" w:hAnsi="Times New Roman" w:cs="Times New Roman"/>
-          <w:kern w:val="0"/>
-          <w:lang w:eastAsia="fr-FR"/>
-          <w14:ligatures w14:val="none"/>
-        </w:rPr>
-      </w:pPr>
-      <w:r>
-        <w:rPr>
-          <w:rFonts w:ascii="Times New Roman" w:eastAsia="Times New Roman" w:hAnsi="Times New Roman" w:cs="Times New Roman"/>
+          <w:rFonts w:eastAsia="Times New Roman" w:cs="Times New Roman"/>
+          <w:kern w:val="0"/>
+          <w:lang w:eastAsia="fr-FR"/>
+          <w14:ligatures w14:val="none"/>
+        </w:rPr>
+      </w:pPr>
+      <w:r>
+        <w:rPr>
+          <w:rFonts w:eastAsia="Times New Roman" w:cs="Times New Roman"/>
           <w:i/>
           <w:iCs/>
           <w:kern w:val="0"/>
@@ -284,7 +284,7 @@
       </w:r>
       <w:r>
         <w:rPr>
-          <w:rFonts w:ascii="Times New Roman" w:eastAsia="Times New Roman" w:hAnsi="Times New Roman" w:cs="Times New Roman"/>
+          <w:rFonts w:eastAsia="Times New Roman" w:cs="Times New Roman"/>
           <w:kern w:val="0"/>
           <w:lang w:eastAsia="fr-FR"/>
           <w14:ligatures w14:val="none"/>
@@ -293,7 +293,7 @@
       </w:r>
       <w:r>
         <w:rPr>
-          <w:rFonts w:ascii="Courier New" w:eastAsia="Times New Roman" w:hAnsi="Courier New" w:cs="Courier New"/>
+          <w:rFonts w:eastAsia="Times New Roman" w:cs="Courier New"/>
           <w:kern w:val="0"/>
           <w:sz w:val="20"/>
           <w:szCs w:val="20"/>
@@ -304,7 +304,7 @@
       </w:r>
       <w:r>
         <w:rPr>
-          <w:rFonts w:ascii="Times New Roman" w:eastAsia="Times New Roman" w:hAnsi="Times New Roman" w:cs="Times New Roman"/>
+          <w:rFonts w:eastAsia="Times New Roman" w:cs="Times New Roman"/>
           <w:kern w:val="0"/>
           <w:lang w:eastAsia="fr-FR"/>
           <w14:ligatures w14:val="none"/>
@@ -320,15 +320,15 @@
         </w:numPr>
         <w:spacing w:before="100" w:beforeAutospacing="1" w:after="100" w:afterAutospacing="1" w:line="240" w:lineRule="auto"/>
         <w:rPr>
-          <w:rFonts w:ascii="Times New Roman" w:eastAsia="Times New Roman" w:hAnsi="Times New Roman" w:cs="Times New Roman"/>
-          <w:kern w:val="0"/>
-          <w:lang w:eastAsia="fr-FR"/>
-          <w14:ligatures w14:val="none"/>
-        </w:rPr>
-      </w:pPr>
-      <w:r>
-        <w:rPr>
-          <w:rFonts w:ascii="Times New Roman" w:eastAsia="Times New Roman" w:hAnsi="Times New Roman" w:cs="Times New Roman"/>
+          <w:rFonts w:eastAsia="Times New Roman" w:cs="Times New Roman"/>
+          <w:kern w:val="0"/>
+          <w:lang w:eastAsia="fr-FR"/>
+          <w14:ligatures w14:val="none"/>
+        </w:rPr>
+      </w:pPr>
+      <w:r>
+        <w:rPr>
+          <w:rFonts w:eastAsia="Times New Roman" w:cs="Times New Roman"/>
           <w:i/>
           <w:iCs/>
           <w:kern w:val="0"/>
@@ -340,7 +340,7 @@
       <w:proofErr w:type="spellStart"/>
       <w:r>
         <w:rPr>
-          <w:rFonts w:ascii="Times New Roman" w:eastAsia="Times New Roman" w:hAnsi="Times New Roman" w:cs="Times New Roman"/>
+          <w:rFonts w:eastAsia="Times New Roman" w:cs="Times New Roman"/>
           <w:i/>
           <w:iCs/>
           <w:kern w:val="0"/>
@@ -352,7 +352,7 @@
       <w:proofErr w:type="spellEnd"/>
       <w:r>
         <w:rPr>
-          <w:rFonts w:ascii="Times New Roman" w:eastAsia="Times New Roman" w:hAnsi="Times New Roman" w:cs="Times New Roman"/>
+          <w:rFonts w:eastAsia="Times New Roman" w:cs="Times New Roman"/>
           <w:i/>
           <w:iCs/>
           <w:kern w:val="0"/>
@@ -363,7 +363,7 @@
       </w:r>
       <w:r>
         <w:rPr>
-          <w:rFonts w:ascii="Times New Roman" w:eastAsia="Times New Roman" w:hAnsi="Times New Roman" w:cs="Times New Roman"/>
+          <w:rFonts w:eastAsia="Times New Roman" w:cs="Times New Roman"/>
           <w:kern w:val="0"/>
           <w:lang w:eastAsia="fr-FR"/>
           <w14:ligatures w14:val="none"/>
@@ -372,7 +372,7 @@
       </w:r>
       <w:r>
         <w:rPr>
-          <w:rFonts w:ascii="Courier New" w:eastAsia="Times New Roman" w:hAnsi="Courier New" w:cs="Courier New"/>
+          <w:rFonts w:eastAsia="Times New Roman" w:cs="Courier New"/>
           <w:kern w:val="0"/>
           <w:sz w:val="20"/>
           <w:szCs w:val="20"/>
@@ -383,7 +383,7 @@
       </w:r>
       <w:r>
         <w:rPr>
-          <w:rFonts w:ascii="Times New Roman" w:eastAsia="Times New Roman" w:hAnsi="Times New Roman" w:cs="Times New Roman"/>
+          <w:rFonts w:eastAsia="Times New Roman" w:cs="Times New Roman"/>
           <w:kern w:val="0"/>
           <w:lang w:eastAsia="fr-FR"/>
           <w14:ligatures w14:val="none"/>
@@ -392,7 +392,7 @@
       </w:r>
       <w:r>
         <w:rPr>
-          <w:rFonts w:ascii="Courier New" w:eastAsia="Times New Roman" w:hAnsi="Courier New" w:cs="Courier New"/>
+          <w:rFonts w:eastAsia="Times New Roman" w:cs="Courier New"/>
           <w:kern w:val="0"/>
           <w:sz w:val="20"/>
           <w:szCs w:val="20"/>
@@ -403,7 +403,7 @@
       </w:r>
       <w:r>
         <w:rPr>
-          <w:rFonts w:ascii="Times New Roman" w:eastAsia="Times New Roman" w:hAnsi="Times New Roman" w:cs="Times New Roman"/>
+          <w:rFonts w:eastAsia="Times New Roman" w:cs="Times New Roman"/>
           <w:kern w:val="0"/>
           <w:lang w:eastAsia="fr-FR"/>
           <w14:ligatures w14:val="none"/>
@@ -419,15 +419,15 @@
         </w:numPr>
         <w:spacing w:before="100" w:beforeAutospacing="1" w:after="100" w:afterAutospacing="1" w:line="240" w:lineRule="auto"/>
         <w:rPr>
-          <w:rFonts w:ascii="Times New Roman" w:eastAsia="Times New Roman" w:hAnsi="Times New Roman" w:cs="Times New Roman"/>
-          <w:kern w:val="0"/>
-          <w:lang w:eastAsia="fr-FR"/>
-          <w14:ligatures w14:val="none"/>
-        </w:rPr>
-      </w:pPr>
-      <w:r>
-        <w:rPr>
-          <w:rFonts w:ascii="Times New Roman" w:eastAsia="Times New Roman" w:hAnsi="Times New Roman" w:cs="Times New Roman"/>
+          <w:rFonts w:eastAsia="Times New Roman" w:cs="Times New Roman"/>
+          <w:kern w:val="0"/>
+          <w:lang w:eastAsia="fr-FR"/>
+          <w14:ligatures w14:val="none"/>
+        </w:rPr>
+      </w:pPr>
+      <w:r>
+        <w:rPr>
+          <w:rFonts w:eastAsia="Times New Roman" w:cs="Times New Roman"/>
           <w:b/>
           <w:bCs/>
           <w:kern w:val="0"/>
@@ -445,15 +445,15 @@
         </w:numPr>
         <w:spacing w:before="100" w:beforeAutospacing="1" w:after="100" w:afterAutospacing="1" w:line="240" w:lineRule="auto"/>
         <w:rPr>
-          <w:rFonts w:ascii="Times New Roman" w:eastAsia="Times New Roman" w:hAnsi="Times New Roman" w:cs="Times New Roman"/>
-          <w:kern w:val="0"/>
-          <w:lang w:eastAsia="fr-FR"/>
-          <w14:ligatures w14:val="none"/>
-        </w:rPr>
-      </w:pPr>
-      <w:r>
-        <w:rPr>
-          <w:rFonts w:ascii="Times New Roman" w:eastAsia="Times New Roman" w:hAnsi="Times New Roman" w:cs="Times New Roman"/>
+          <w:rFonts w:eastAsia="Times New Roman" w:cs="Times New Roman"/>
+          <w:kern w:val="0"/>
+          <w:lang w:eastAsia="fr-FR"/>
+          <w14:ligatures w14:val="none"/>
+        </w:rPr>
+      </w:pPr>
+      <w:r>
+        <w:rPr>
+          <w:rFonts w:eastAsia="Times New Roman" w:cs="Times New Roman"/>
           <w:i/>
           <w:iCs/>
           <w:kern w:val="0"/>
@@ -464,7 +464,7 @@
       </w:r>
       <w:r>
         <w:rPr>
-          <w:rFonts w:ascii="Times New Roman" w:eastAsia="Times New Roman" w:hAnsi="Times New Roman" w:cs="Times New Roman"/>
+          <w:rFonts w:eastAsia="Times New Roman" w:cs="Times New Roman"/>
           <w:kern w:val="0"/>
           <w:lang w:eastAsia="fr-FR"/>
           <w14:ligatures w14:val="none"/>
@@ -480,15 +480,15 @@
         </w:numPr>
         <w:spacing w:before="100" w:beforeAutospacing="1" w:after="100" w:afterAutospacing="1" w:line="240" w:lineRule="auto"/>
         <w:rPr>
-          <w:rFonts w:ascii="Times New Roman" w:eastAsia="Times New Roman" w:hAnsi="Times New Roman" w:cs="Times New Roman"/>
-          <w:kern w:val="0"/>
-          <w:lang w:eastAsia="fr-FR"/>
-          <w14:ligatures w14:val="none"/>
-        </w:rPr>
-      </w:pPr>
-      <w:r>
-        <w:rPr>
-          <w:rFonts w:ascii="Times New Roman" w:eastAsia="Times New Roman" w:hAnsi="Times New Roman" w:cs="Times New Roman"/>
+          <w:rFonts w:eastAsia="Times New Roman" w:cs="Times New Roman"/>
+          <w:kern w:val="0"/>
+          <w:lang w:eastAsia="fr-FR"/>
+          <w14:ligatures w14:val="none"/>
+        </w:rPr>
+      </w:pPr>
+      <w:r>
+        <w:rPr>
+          <w:rFonts w:eastAsia="Times New Roman" w:cs="Times New Roman"/>
           <w:i/>
           <w:iCs/>
           <w:kern w:val="0"/>
@@ -499,7 +499,7 @@
       </w:r>
       <w:r>
         <w:rPr>
-          <w:rFonts w:ascii="Times New Roman" w:eastAsia="Times New Roman" w:hAnsi="Times New Roman" w:cs="Times New Roman"/>
+          <w:rFonts w:eastAsia="Times New Roman" w:cs="Times New Roman"/>
           <w:kern w:val="0"/>
           <w:lang w:eastAsia="fr-FR"/>
           <w14:ligatures w14:val="none"/>
@@ -508,7 +508,7 @@
       </w:r>
       <w:r>
         <w:rPr>
-          <w:rFonts w:ascii="Courier New" w:eastAsia="Times New Roman" w:hAnsi="Courier New" w:cs="Courier New"/>
+          <w:rFonts w:eastAsia="Times New Roman" w:cs="Courier New"/>
           <w:kern w:val="0"/>
           <w:sz w:val="20"/>
           <w:szCs w:val="20"/>
@@ -519,7 +519,7 @@
       </w:r>
       <w:r>
         <w:rPr>
-          <w:rFonts w:ascii="Times New Roman" w:eastAsia="Times New Roman" w:hAnsi="Times New Roman" w:cs="Times New Roman"/>
+          <w:rFonts w:eastAsia="Times New Roman" w:cs="Times New Roman"/>
           <w:kern w:val="0"/>
           <w:lang w:eastAsia="fr-FR"/>
           <w14:ligatures w14:val="none"/>
@@ -535,15 +535,15 @@
         </w:numPr>
         <w:spacing w:before="100" w:beforeAutospacing="1" w:after="100" w:afterAutospacing="1" w:line="240" w:lineRule="auto"/>
         <w:rPr>
-          <w:rFonts w:ascii="Times New Roman" w:eastAsia="Times New Roman" w:hAnsi="Times New Roman" w:cs="Times New Roman"/>
-          <w:kern w:val="0"/>
-          <w:lang w:eastAsia="fr-FR"/>
-          <w14:ligatures w14:val="none"/>
-        </w:rPr>
-      </w:pPr>
-      <w:r>
-        <w:rPr>
-          <w:rFonts w:ascii="Times New Roman" w:eastAsia="Times New Roman" w:hAnsi="Times New Roman" w:cs="Times New Roman"/>
+          <w:rFonts w:eastAsia="Times New Roman" w:cs="Times New Roman"/>
+          <w:kern w:val="0"/>
+          <w:lang w:eastAsia="fr-FR"/>
+          <w14:ligatures w14:val="none"/>
+        </w:rPr>
+      </w:pPr>
+      <w:r>
+        <w:rPr>
+          <w:rFonts w:eastAsia="Times New Roman" w:cs="Times New Roman"/>
           <w:b/>
           <w:bCs/>
           <w:kern w:val="0"/>
@@ -561,15 +561,15 @@
         </w:numPr>
         <w:spacing w:before="100" w:beforeAutospacing="1" w:after="100" w:afterAutospacing="1" w:line="240" w:lineRule="auto"/>
         <w:rPr>
-          <w:rFonts w:ascii="Times New Roman" w:eastAsia="Times New Roman" w:hAnsi="Times New Roman" w:cs="Times New Roman"/>
-          <w:kern w:val="0"/>
-          <w:lang w:eastAsia="fr-FR"/>
-          <w14:ligatures w14:val="none"/>
-        </w:rPr>
-      </w:pPr>
-      <w:r>
-        <w:rPr>
-          <w:rFonts w:ascii="Times New Roman" w:eastAsia="Times New Roman" w:hAnsi="Times New Roman" w:cs="Times New Roman"/>
+          <w:rFonts w:eastAsia="Times New Roman" w:cs="Times New Roman"/>
+          <w:kern w:val="0"/>
+          <w:lang w:eastAsia="fr-FR"/>
+          <w14:ligatures w14:val="none"/>
+        </w:rPr>
+      </w:pPr>
+      <w:r>
+        <w:rPr>
+          <w:rFonts w:eastAsia="Times New Roman" w:cs="Times New Roman"/>
           <w:i/>
           <w:iCs/>
           <w:kern w:val="0"/>
@@ -580,7 +580,7 @@
       </w:r>
       <w:r>
         <w:rPr>
-          <w:rFonts w:ascii="Times New Roman" w:eastAsia="Times New Roman" w:hAnsi="Times New Roman" w:cs="Times New Roman"/>
+          <w:rFonts w:eastAsia="Times New Roman" w:cs="Times New Roman"/>
           <w:kern w:val="0"/>
           <w:lang w:eastAsia="fr-FR"/>
           <w14:ligatures w14:val="none"/>
@@ -589,7 +589,7 @@
       </w:r>
       <w:r>
         <w:rPr>
-          <w:rFonts w:ascii="Times New Roman" w:eastAsia="Times New Roman" w:hAnsi="Times New Roman" w:cs="Times New Roman"/>
+          <w:rFonts w:eastAsia="Times New Roman" w:cs="Times New Roman"/>
           <w:b/>
           <w:bCs/>
           <w:kern w:val="0"/>
@@ -600,7 +600,7 @@
       </w:r>
       <w:r>
         <w:rPr>
-          <w:rFonts w:ascii="Times New Roman" w:eastAsia="Times New Roman" w:hAnsi="Times New Roman" w:cs="Times New Roman"/>
+          <w:rFonts w:eastAsia="Times New Roman" w:cs="Times New Roman"/>
           <w:kern w:val="0"/>
           <w:lang w:eastAsia="fr-FR"/>
           <w14:ligatures w14:val="none"/>
@@ -616,15 +616,15 @@
         </w:numPr>
         <w:spacing w:before="100" w:beforeAutospacing="1" w:after="100" w:afterAutospacing="1" w:line="240" w:lineRule="auto"/>
         <w:rPr>
-          <w:rFonts w:ascii="Times New Roman" w:eastAsia="Times New Roman" w:hAnsi="Times New Roman" w:cs="Times New Roman"/>
-          <w:kern w:val="0"/>
-          <w:lang w:eastAsia="fr-FR"/>
-          <w14:ligatures w14:val="none"/>
-        </w:rPr>
-      </w:pPr>
-      <w:r>
-        <w:rPr>
-          <w:rFonts w:ascii="Times New Roman" w:eastAsia="Times New Roman" w:hAnsi="Times New Roman" w:cs="Times New Roman"/>
+          <w:rFonts w:eastAsia="Times New Roman" w:cs="Times New Roman"/>
+          <w:kern w:val="0"/>
+          <w:lang w:eastAsia="fr-FR"/>
+          <w14:ligatures w14:val="none"/>
+        </w:rPr>
+      </w:pPr>
+      <w:r>
+        <w:rPr>
+          <w:rFonts w:eastAsia="Times New Roman" w:cs="Times New Roman"/>
           <w:i/>
           <w:iCs/>
           <w:kern w:val="0"/>
@@ -635,7 +635,7 @@
       </w:r>
       <w:r>
         <w:rPr>
-          <w:rFonts w:ascii="Times New Roman" w:eastAsia="Times New Roman" w:hAnsi="Times New Roman" w:cs="Times New Roman"/>
+          <w:rFonts w:eastAsia="Times New Roman" w:cs="Times New Roman"/>
           <w:kern w:val="0"/>
           <w:lang w:eastAsia="fr-FR"/>
           <w14:ligatures w14:val="none"/>
@@ -644,7 +644,7 @@
       </w:r>
       <w:r>
         <w:rPr>
-          <w:rFonts w:ascii="Courier New" w:eastAsia="Times New Roman" w:hAnsi="Courier New" w:cs="Courier New"/>
+          <w:rFonts w:eastAsia="Times New Roman" w:cs="Courier New"/>
           <w:kern w:val="0"/>
           <w:sz w:val="20"/>
           <w:szCs w:val="20"/>
@@ -655,7 +655,7 @@
       </w:r>
       <w:r>
         <w:rPr>
-          <w:rFonts w:ascii="Times New Roman" w:eastAsia="Times New Roman" w:hAnsi="Times New Roman" w:cs="Times New Roman"/>
+          <w:rFonts w:eastAsia="Times New Roman" w:cs="Times New Roman"/>
           <w:kern w:val="0"/>
           <w:lang w:eastAsia="fr-FR"/>
           <w14:ligatures w14:val="none"/>
@@ -664,7 +664,7 @@
       </w:r>
       <w:r>
         <w:rPr>
-          <w:rFonts w:ascii="Courier New" w:eastAsia="Times New Roman" w:hAnsi="Courier New" w:cs="Courier New"/>
+          <w:rFonts w:eastAsia="Times New Roman" w:cs="Courier New"/>
           <w:kern w:val="0"/>
           <w:sz w:val="20"/>
           <w:szCs w:val="20"/>
@@ -675,7 +675,7 @@
       </w:r>
       <w:r>
         <w:rPr>
-          <w:rFonts w:ascii="Times New Roman" w:eastAsia="Times New Roman" w:hAnsi="Times New Roman" w:cs="Times New Roman"/>
+          <w:rFonts w:eastAsia="Times New Roman" w:cs="Times New Roman"/>
           <w:kern w:val="0"/>
           <w:lang w:eastAsia="fr-FR"/>
           <w14:ligatures w14:val="none"/>
@@ -691,15 +691,15 @@
         </w:numPr>
         <w:spacing w:before="100" w:beforeAutospacing="1" w:after="100" w:afterAutospacing="1" w:line="240" w:lineRule="auto"/>
         <w:rPr>
-          <w:rFonts w:ascii="Times New Roman" w:eastAsia="Times New Roman" w:hAnsi="Times New Roman" w:cs="Times New Roman"/>
-          <w:kern w:val="0"/>
-          <w:lang w:eastAsia="fr-FR"/>
-          <w14:ligatures w14:val="none"/>
-        </w:rPr>
-      </w:pPr>
-      <w:r>
-        <w:rPr>
-          <w:rFonts w:ascii="Times New Roman" w:eastAsia="Times New Roman" w:hAnsi="Times New Roman" w:cs="Times New Roman"/>
+          <w:rFonts w:eastAsia="Times New Roman" w:cs="Times New Roman"/>
+          <w:kern w:val="0"/>
+          <w:lang w:eastAsia="fr-FR"/>
+          <w14:ligatures w14:val="none"/>
+        </w:rPr>
+      </w:pPr>
+      <w:r>
+        <w:rPr>
+          <w:rFonts w:eastAsia="Times New Roman" w:cs="Times New Roman"/>
           <w:b/>
           <w:bCs/>
           <w:kern w:val="0"/>
@@ -717,15 +717,15 @@
         </w:numPr>
         <w:spacing w:before="100" w:beforeAutospacing="1" w:after="100" w:afterAutospacing="1" w:line="240" w:lineRule="auto"/>
         <w:rPr>
-          <w:rFonts w:ascii="Times New Roman" w:eastAsia="Times New Roman" w:hAnsi="Times New Roman" w:cs="Times New Roman"/>
-          <w:kern w:val="0"/>
-          <w:lang w:eastAsia="fr-FR"/>
-          <w14:ligatures w14:val="none"/>
-        </w:rPr>
-      </w:pPr>
-      <w:r>
-        <w:rPr>
-          <w:rFonts w:ascii="Times New Roman" w:eastAsia="Times New Roman" w:hAnsi="Times New Roman" w:cs="Times New Roman"/>
+          <w:rFonts w:eastAsia="Times New Roman" w:cs="Times New Roman"/>
+          <w:kern w:val="0"/>
+          <w:lang w:eastAsia="fr-FR"/>
+          <w14:ligatures w14:val="none"/>
+        </w:rPr>
+      </w:pPr>
+      <w:r>
+        <w:rPr>
+          <w:rFonts w:eastAsia="Times New Roman" w:cs="Times New Roman"/>
           <w:i/>
           <w:iCs/>
           <w:kern w:val="0"/>
@@ -736,7 +736,7 @@
       </w:r>
       <w:r>
         <w:rPr>
-          <w:rFonts w:ascii="Times New Roman" w:eastAsia="Times New Roman" w:hAnsi="Times New Roman" w:cs="Times New Roman"/>
+          <w:rFonts w:eastAsia="Times New Roman" w:cs="Times New Roman"/>
           <w:kern w:val="0"/>
           <w:lang w:eastAsia="fr-FR"/>
           <w14:ligatures w14:val="none"/>
@@ -745,7 +745,7 @@
       </w:r>
       <w:r>
         <w:rPr>
-          <w:rFonts w:ascii="Courier New" w:eastAsia="Times New Roman" w:hAnsi="Courier New" w:cs="Courier New"/>
+          <w:rFonts w:eastAsia="Times New Roman" w:cs="Courier New"/>
           <w:kern w:val="0"/>
           <w:sz w:val="20"/>
           <w:szCs w:val="20"/>
@@ -756,7 +756,7 @@
       </w:r>
       <w:r>
         <w:rPr>
-          <w:rFonts w:ascii="Times New Roman" w:eastAsia="Times New Roman" w:hAnsi="Times New Roman" w:cs="Times New Roman"/>
+          <w:rFonts w:eastAsia="Times New Roman" w:cs="Times New Roman"/>
           <w:kern w:val="0"/>
           <w:lang w:eastAsia="fr-FR"/>
           <w14:ligatures w14:val="none"/>
@@ -765,7 +765,7 @@
       </w:r>
       <w:r>
         <w:rPr>
-          <w:rFonts w:ascii="Courier New" w:eastAsia="Times New Roman" w:hAnsi="Courier New" w:cs="Courier New"/>
+          <w:rFonts w:eastAsia="Times New Roman" w:cs="Courier New"/>
           <w:kern w:val="0"/>
           <w:sz w:val="20"/>
           <w:szCs w:val="20"/>
@@ -776,7 +776,7 @@
       </w:r>
       <w:r>
         <w:rPr>
-          <w:rFonts w:ascii="Times New Roman" w:eastAsia="Times New Roman" w:hAnsi="Times New Roman" w:cs="Times New Roman"/>
+          <w:rFonts w:eastAsia="Times New Roman" w:cs="Times New Roman"/>
           <w:kern w:val="0"/>
           <w:lang w:eastAsia="fr-FR"/>
           <w14:ligatures w14:val="none"/>
@@ -792,15 +792,15 @@
         </w:numPr>
         <w:spacing w:before="100" w:beforeAutospacing="1" w:after="100" w:afterAutospacing="1" w:line="240" w:lineRule="auto"/>
         <w:rPr>
-          <w:rFonts w:ascii="Times New Roman" w:eastAsia="Times New Roman" w:hAnsi="Times New Roman" w:cs="Times New Roman"/>
-          <w:kern w:val="0"/>
-          <w:lang w:eastAsia="fr-FR"/>
-          <w14:ligatures w14:val="none"/>
-        </w:rPr>
-      </w:pPr>
-      <w:r>
-        <w:rPr>
-          <w:rFonts w:ascii="Times New Roman" w:eastAsia="Times New Roman" w:hAnsi="Times New Roman" w:cs="Times New Roman"/>
+          <w:rFonts w:eastAsia="Times New Roman" w:cs="Times New Roman"/>
+          <w:kern w:val="0"/>
+          <w:lang w:eastAsia="fr-FR"/>
+          <w14:ligatures w14:val="none"/>
+        </w:rPr>
+      </w:pPr>
+      <w:r>
+        <w:rPr>
+          <w:rFonts w:eastAsia="Times New Roman" w:cs="Times New Roman"/>
           <w:i/>
           <w:iCs/>
           <w:kern w:val="0"/>
@@ -811,7 +811,7 @@
       </w:r>
       <w:r>
         <w:rPr>
-          <w:rFonts w:ascii="Times New Roman" w:eastAsia="Times New Roman" w:hAnsi="Times New Roman" w:cs="Times New Roman"/>
+          <w:rFonts w:eastAsia="Times New Roman" w:cs="Times New Roman"/>
           <w:kern w:val="0"/>
           <w:lang w:eastAsia="fr-FR"/>
           <w14:ligatures w14:val="none"/>
@@ -820,7 +820,7 @@
       </w:r>
       <w:r>
         <w:rPr>
-          <w:rFonts w:ascii="Courier New" w:eastAsia="Times New Roman" w:hAnsi="Courier New" w:cs="Courier New"/>
+          <w:rFonts w:eastAsia="Times New Roman" w:cs="Courier New"/>
           <w:kern w:val="0"/>
           <w:sz w:val="20"/>
           <w:szCs w:val="20"/>
@@ -831,7 +831,7 @@
       </w:r>
       <w:r>
         <w:rPr>
-          <w:rFonts w:ascii="Times New Roman" w:eastAsia="Times New Roman" w:hAnsi="Times New Roman" w:cs="Times New Roman"/>
+          <w:rFonts w:eastAsia="Times New Roman" w:cs="Times New Roman"/>
           <w:kern w:val="0"/>
           <w:lang w:eastAsia="fr-FR"/>
           <w14:ligatures w14:val="none"/>
@@ -840,7 +840,7 @@
       </w:r>
       <w:r>
         <w:rPr>
-          <w:rFonts w:ascii="Courier New" w:eastAsia="Times New Roman" w:hAnsi="Courier New" w:cs="Courier New"/>
+          <w:rFonts w:eastAsia="Times New Roman" w:cs="Courier New"/>
           <w:kern w:val="0"/>
           <w:sz w:val="20"/>
           <w:szCs w:val="20"/>
@@ -851,7 +851,7 @@
       </w:r>
       <w:r>
         <w:rPr>
-          <w:rFonts w:ascii="Times New Roman" w:eastAsia="Times New Roman" w:hAnsi="Times New Roman" w:cs="Times New Roman"/>
+          <w:rFonts w:eastAsia="Times New Roman" w:cs="Times New Roman"/>
           <w:kern w:val="0"/>
           <w:lang w:eastAsia="fr-FR"/>
           <w14:ligatures w14:val="none"/>
@@ -864,7 +864,7 @@
         <w:spacing w:before="100" w:beforeAutospacing="1" w:after="100" w:afterAutospacing="1" w:line="240" w:lineRule="auto"/>
         <w:outlineLvl w:val="1"/>
         <w:rPr>
-          <w:rFonts w:ascii="Times New Roman" w:eastAsia="Times New Roman" w:hAnsi="Times New Roman" w:cs="Times New Roman"/>
+          <w:rFonts w:eastAsia="Times New Roman" w:cs="Times New Roman"/>
           <w:b/>
           <w:bCs/>
           <w:kern w:val="0"/>
@@ -876,7 +876,7 @@
       </w:pPr>
       <w:r>
         <w:rPr>
-          <w:rFonts w:ascii="Times New Roman" w:eastAsia="Times New Roman" w:hAnsi="Times New Roman" w:cs="Times New Roman"/>
+          <w:rFonts w:eastAsia="Times New Roman" w:cs="Times New Roman"/>
           <w:b/>
           <w:bCs/>
           <w:kern w:val="0"/>
@@ -902,7 +902,7 @@
       </w:r>
       <w:r>
         <w:rPr>
-          <w:rFonts w:ascii="Times New Roman" w:eastAsia="Times New Roman" w:hAnsi="Times New Roman" w:cs="Times New Roman"/>
+          <w:rFonts w:eastAsia="Times New Roman" w:cs="Times New Roman"/>
           <w:b/>
           <w:bCs/>
           <w:kern w:val="0"/>
@@ -918,15 +918,15 @@
       <w:pPr>
         <w:spacing w:before="100" w:beforeAutospacing="1" w:after="100" w:afterAutospacing="1" w:line="240" w:lineRule="auto"/>
         <w:rPr>
-          <w:rFonts w:ascii="Times New Roman" w:eastAsia="Times New Roman" w:hAnsi="Times New Roman" w:cs="Times New Roman"/>
-          <w:kern w:val="0"/>
-          <w:lang w:eastAsia="fr-FR"/>
-          <w14:ligatures w14:val="none"/>
-        </w:rPr>
-      </w:pPr>
-      <w:r>
-        <w:rPr>
-          <w:rFonts w:ascii="Times New Roman" w:eastAsia="Times New Roman" w:hAnsi="Times New Roman" w:cs="Times New Roman"/>
+          <w:rFonts w:eastAsia="Times New Roman" w:cs="Times New Roman"/>
+          <w:kern w:val="0"/>
+          <w:lang w:eastAsia="fr-FR"/>
+          <w14:ligatures w14:val="none"/>
+        </w:rPr>
+      </w:pPr>
+      <w:r>
+        <w:rPr>
+          <w:rFonts w:eastAsia="Times New Roman" w:cs="Times New Roman"/>
           <w:kern w:val="0"/>
           <w:lang w:eastAsia="fr-FR"/>
           <w14:ligatures w14:val="none"/>
@@ -942,15 +942,15 @@
         </w:numPr>
         <w:spacing w:before="100" w:beforeAutospacing="1" w:after="100" w:afterAutospacing="1" w:line="240" w:lineRule="auto"/>
         <w:rPr>
-          <w:rFonts w:ascii="Times New Roman" w:eastAsia="Times New Roman" w:hAnsi="Times New Roman" w:cs="Times New Roman"/>
-          <w:kern w:val="0"/>
-          <w:lang w:eastAsia="fr-FR"/>
-          <w14:ligatures w14:val="none"/>
-        </w:rPr>
-      </w:pPr>
-      <w:r>
-        <w:rPr>
-          <w:rFonts w:ascii="Times New Roman" w:eastAsia="Times New Roman" w:hAnsi="Times New Roman" w:cs="Times New Roman"/>
+          <w:rFonts w:eastAsia="Times New Roman" w:cs="Times New Roman"/>
+          <w:kern w:val="0"/>
+          <w:lang w:eastAsia="fr-FR"/>
+          <w14:ligatures w14:val="none"/>
+        </w:rPr>
+      </w:pPr>
+      <w:r>
+        <w:rPr>
+          <w:rFonts w:eastAsia="Times New Roman" w:cs="Times New Roman"/>
           <w:b/>
           <w:bCs/>
           <w:kern w:val="0"/>
@@ -961,7 +961,7 @@
       </w:r>
       <w:r>
         <w:rPr>
-          <w:rFonts w:ascii="Courier New" w:eastAsia="Times New Roman" w:hAnsi="Courier New" w:cs="Courier New"/>
+          <w:rFonts w:eastAsia="Times New Roman" w:cs="Courier New"/>
           <w:b/>
           <w:bCs/>
           <w:kern w:val="0"/>
@@ -981,15 +981,15 @@
         </w:numPr>
         <w:spacing w:before="100" w:beforeAutospacing="1" w:after="100" w:afterAutospacing="1" w:line="240" w:lineRule="auto"/>
         <w:rPr>
-          <w:rFonts w:ascii="Times New Roman" w:eastAsia="Times New Roman" w:hAnsi="Times New Roman" w:cs="Times New Roman"/>
-          <w:kern w:val="0"/>
-          <w:lang w:eastAsia="fr-FR"/>
-          <w14:ligatures w14:val="none"/>
-        </w:rPr>
-      </w:pPr>
-      <w:r>
-        <w:rPr>
-          <w:rFonts w:ascii="Times New Roman" w:eastAsia="Times New Roman" w:hAnsi="Times New Roman" w:cs="Times New Roman"/>
+          <w:rFonts w:eastAsia="Times New Roman" w:cs="Times New Roman"/>
+          <w:kern w:val="0"/>
+          <w:lang w:eastAsia="fr-FR"/>
+          <w14:ligatures w14:val="none"/>
+        </w:rPr>
+      </w:pPr>
+      <w:r>
+        <w:rPr>
+          <w:rFonts w:eastAsia="Times New Roman" w:cs="Times New Roman"/>
           <w:i/>
           <w:iCs/>
           <w:kern w:val="0"/>
@@ -1000,7 +1000,7 @@
       </w:r>
       <w:r>
         <w:rPr>
-          <w:rFonts w:ascii="Times New Roman" w:eastAsia="Times New Roman" w:hAnsi="Times New Roman" w:cs="Times New Roman"/>
+          <w:rFonts w:eastAsia="Times New Roman" w:cs="Times New Roman"/>
           <w:kern w:val="0"/>
           <w:lang w:eastAsia="fr-FR"/>
           <w14:ligatures w14:val="none"/>
@@ -1016,15 +1016,15 @@
         </w:numPr>
         <w:spacing w:before="100" w:beforeAutospacing="1" w:after="100" w:afterAutospacing="1" w:line="240" w:lineRule="auto"/>
         <w:rPr>
-          <w:rFonts w:ascii="Times New Roman" w:eastAsia="Times New Roman" w:hAnsi="Times New Roman" w:cs="Times New Roman"/>
-          <w:kern w:val="0"/>
-          <w:lang w:eastAsia="fr-FR"/>
-          <w14:ligatures w14:val="none"/>
-        </w:rPr>
-      </w:pPr>
-      <w:r>
-        <w:rPr>
-          <w:rFonts w:ascii="Times New Roman" w:eastAsia="Times New Roman" w:hAnsi="Times New Roman" w:cs="Times New Roman"/>
+          <w:rFonts w:eastAsia="Times New Roman" w:cs="Times New Roman"/>
+          <w:kern w:val="0"/>
+          <w:lang w:eastAsia="fr-FR"/>
+          <w14:ligatures w14:val="none"/>
+        </w:rPr>
+      </w:pPr>
+      <w:r>
+        <w:rPr>
+          <w:rFonts w:eastAsia="Times New Roman" w:cs="Times New Roman"/>
           <w:i/>
           <w:iCs/>
           <w:kern w:val="0"/>
@@ -1035,7 +1035,7 @@
       </w:r>
       <w:r>
         <w:rPr>
-          <w:rFonts w:ascii="Times New Roman" w:eastAsia="Times New Roman" w:hAnsi="Times New Roman" w:cs="Times New Roman"/>
+          <w:rFonts w:eastAsia="Times New Roman" w:cs="Times New Roman"/>
           <w:kern w:val="0"/>
           <w:lang w:eastAsia="fr-FR"/>
           <w14:ligatures w14:val="none"/>
@@ -1051,15 +1051,15 @@
         </w:numPr>
         <w:spacing w:before="100" w:beforeAutospacing="1" w:after="100" w:afterAutospacing="1" w:line="240" w:lineRule="auto"/>
         <w:rPr>
-          <w:rFonts w:ascii="Times New Roman" w:eastAsia="Times New Roman" w:hAnsi="Times New Roman" w:cs="Times New Roman"/>
-          <w:kern w:val="0"/>
-          <w:lang w:eastAsia="fr-FR"/>
-          <w14:ligatures w14:val="none"/>
-        </w:rPr>
-      </w:pPr>
-      <w:r>
-        <w:rPr>
-          <w:rFonts w:ascii="Times New Roman" w:eastAsia="Times New Roman" w:hAnsi="Times New Roman" w:cs="Times New Roman"/>
+          <w:rFonts w:eastAsia="Times New Roman" w:cs="Times New Roman"/>
+          <w:kern w:val="0"/>
+          <w:lang w:eastAsia="fr-FR"/>
+          <w14:ligatures w14:val="none"/>
+        </w:rPr>
+      </w:pPr>
+      <w:r>
+        <w:rPr>
+          <w:rFonts w:eastAsia="Times New Roman" w:cs="Times New Roman"/>
           <w:b/>
           <w:bCs/>
           <w:kern w:val="0"/>
@@ -1070,7 +1070,7 @@
       </w:r>
       <w:r>
         <w:rPr>
-          <w:rFonts w:ascii="Courier New" w:eastAsia="Times New Roman" w:hAnsi="Courier New" w:cs="Courier New"/>
+          <w:rFonts w:eastAsia="Times New Roman" w:cs="Courier New"/>
           <w:b/>
           <w:bCs/>
           <w:kern w:val="0"/>
@@ -1090,15 +1090,15 @@
         </w:numPr>
         <w:spacing w:before="100" w:beforeAutospacing="1" w:after="100" w:afterAutospacing="1" w:line="240" w:lineRule="auto"/>
         <w:rPr>
-          <w:rFonts w:ascii="Times New Roman" w:eastAsia="Times New Roman" w:hAnsi="Times New Roman" w:cs="Times New Roman"/>
-          <w:kern w:val="0"/>
-          <w:lang w:eastAsia="fr-FR"/>
-          <w14:ligatures w14:val="none"/>
-        </w:rPr>
-      </w:pPr>
-      <w:r>
-        <w:rPr>
-          <w:rFonts w:ascii="Times New Roman" w:eastAsia="Times New Roman" w:hAnsi="Times New Roman" w:cs="Times New Roman"/>
+          <w:rFonts w:eastAsia="Times New Roman" w:cs="Times New Roman"/>
+          <w:kern w:val="0"/>
+          <w:lang w:eastAsia="fr-FR"/>
+          <w14:ligatures w14:val="none"/>
+        </w:rPr>
+      </w:pPr>
+      <w:r>
+        <w:rPr>
+          <w:rFonts w:eastAsia="Times New Roman" w:cs="Times New Roman"/>
           <w:i/>
           <w:iCs/>
           <w:kern w:val="0"/>
@@ -1109,7 +1109,7 @@
       </w:r>
       <w:r>
         <w:rPr>
-          <w:rFonts w:ascii="Times New Roman" w:eastAsia="Times New Roman" w:hAnsi="Times New Roman" w:cs="Times New Roman"/>
+          <w:rFonts w:eastAsia="Times New Roman" w:cs="Times New Roman"/>
           <w:kern w:val="0"/>
           <w:lang w:eastAsia="fr-FR"/>
           <w14:ligatures w14:val="none"/>
@@ -1125,15 +1125,15 @@
         </w:numPr>
         <w:spacing w:before="100" w:beforeAutospacing="1" w:after="100" w:afterAutospacing="1" w:line="240" w:lineRule="auto"/>
         <w:rPr>
-          <w:rFonts w:ascii="Times New Roman" w:eastAsia="Times New Roman" w:hAnsi="Times New Roman" w:cs="Times New Roman"/>
-          <w:kern w:val="0"/>
-          <w:lang w:eastAsia="fr-FR"/>
-          <w14:ligatures w14:val="none"/>
-        </w:rPr>
-      </w:pPr>
-      <w:r>
-        <w:rPr>
-          <w:rFonts w:ascii="Times New Roman" w:eastAsia="Times New Roman" w:hAnsi="Times New Roman" w:cs="Times New Roman"/>
+          <w:rFonts w:eastAsia="Times New Roman" w:cs="Times New Roman"/>
+          <w:kern w:val="0"/>
+          <w:lang w:eastAsia="fr-FR"/>
+          <w14:ligatures w14:val="none"/>
+        </w:rPr>
+      </w:pPr>
+      <w:r>
+        <w:rPr>
+          <w:rFonts w:eastAsia="Times New Roman" w:cs="Times New Roman"/>
           <w:i/>
           <w:iCs/>
           <w:kern w:val="0"/>
@@ -1144,7 +1144,7 @@
       </w:r>
       <w:r>
         <w:rPr>
-          <w:rFonts w:ascii="Times New Roman" w:eastAsia="Times New Roman" w:hAnsi="Times New Roman" w:cs="Times New Roman"/>
+          <w:rFonts w:eastAsia="Times New Roman" w:cs="Times New Roman"/>
           <w:kern w:val="0"/>
           <w:lang w:eastAsia="fr-FR"/>
           <w14:ligatures w14:val="none"/>
@@ -1157,7 +1157,7 @@
         <w:spacing w:before="100" w:beforeAutospacing="1" w:after="100" w:afterAutospacing="1" w:line="240" w:lineRule="auto"/>
         <w:outlineLvl w:val="1"/>
         <w:rPr>
-          <w:rFonts w:ascii="Times New Roman" w:eastAsia="Times New Roman" w:hAnsi="Times New Roman" w:cs="Times New Roman"/>
+          <w:rFonts w:eastAsia="Times New Roman" w:cs="Times New Roman"/>
           <w:b/>
           <w:bCs/>
           <w:kern w:val="0"/>
@@ -1169,7 +1169,7 @@
       </w:pPr>
       <w:r>
         <w:rPr>
-          <w:rFonts w:ascii="Times New Roman" w:eastAsia="Times New Roman" w:hAnsi="Times New Roman" w:cs="Times New Roman"/>
+          <w:rFonts w:eastAsia="Times New Roman" w:cs="Times New Roman"/>
           <w:b/>
           <w:bCs/>
           <w:kern w:val="0"/>
@@ -1196,7 +1196,7 @@
       </w:r>
       <w:r>
         <w:rPr>
-          <w:rFonts w:ascii="Times New Roman" w:eastAsia="Times New Roman" w:hAnsi="Times New Roman" w:cs="Times New Roman"/>
+          <w:rFonts w:eastAsia="Times New Roman" w:cs="Times New Roman"/>
           <w:b/>
           <w:bCs/>
           <w:kern w:val="0"/>
@@ -1216,15 +1216,15 @@
         </w:numPr>
         <w:spacing w:before="100" w:beforeAutospacing="1" w:after="100" w:afterAutospacing="1" w:line="240" w:lineRule="auto"/>
         <w:rPr>
-          <w:rFonts w:ascii="Times New Roman" w:eastAsia="Times New Roman" w:hAnsi="Times New Roman" w:cs="Times New Roman"/>
-          <w:kern w:val="0"/>
-          <w:lang w:eastAsia="fr-FR"/>
-          <w14:ligatures w14:val="none"/>
-        </w:rPr>
-      </w:pPr>
-      <w:r>
-        <w:rPr>
-          <w:rFonts w:ascii="Times New Roman" w:eastAsia="Times New Roman" w:hAnsi="Times New Roman" w:cs="Times New Roman"/>
+          <w:rFonts w:eastAsia="Times New Roman" w:cs="Times New Roman"/>
+          <w:kern w:val="0"/>
+          <w:lang w:eastAsia="fr-FR"/>
+          <w14:ligatures w14:val="none"/>
+        </w:rPr>
+      </w:pPr>
+      <w:r>
+        <w:rPr>
+          <w:rFonts w:eastAsia="Times New Roman" w:cs="Times New Roman"/>
           <w:b/>
           <w:bCs/>
           <w:kern w:val="0"/>
@@ -1236,7 +1236,7 @@
       <w:proofErr w:type="spellStart"/>
       <w:r>
         <w:rPr>
-          <w:rFonts w:ascii="Courier New" w:eastAsia="Times New Roman" w:hAnsi="Courier New" w:cs="Courier New"/>
+          <w:rFonts w:eastAsia="Times New Roman" w:cs="Courier New"/>
           <w:b/>
           <w:bCs/>
           <w:kern w:val="0"/>
@@ -1250,7 +1250,7 @@
       <w:proofErr w:type="spellEnd"/>
       <w:r>
         <w:rPr>
-          <w:rFonts w:ascii="Courier New" w:eastAsia="Times New Roman" w:hAnsi="Courier New" w:cs="Courier New"/>
+          <w:rFonts w:eastAsia="Times New Roman" w:cs="Courier New"/>
           <w:b/>
           <w:bCs/>
           <w:kern w:val="0"/>
@@ -1263,7 +1263,7 @@
       </w:r>
       <w:r>
         <w:rPr>
-          <w:rFonts w:ascii="Times New Roman" w:eastAsia="Times New Roman" w:hAnsi="Times New Roman" w:cs="Times New Roman"/>
+          <w:rFonts w:eastAsia="Times New Roman" w:cs="Times New Roman"/>
           <w:b/>
           <w:bCs/>
           <w:kern w:val="0"/>
@@ -1281,15 +1281,15 @@
         </w:numPr>
         <w:spacing w:before="100" w:beforeAutospacing="1" w:after="100" w:afterAutospacing="1" w:line="240" w:lineRule="auto"/>
         <w:rPr>
-          <w:rFonts w:ascii="Times New Roman" w:eastAsia="Times New Roman" w:hAnsi="Times New Roman" w:cs="Times New Roman"/>
-          <w:kern w:val="0"/>
-          <w:lang w:eastAsia="fr-FR"/>
-          <w14:ligatures w14:val="none"/>
-        </w:rPr>
-      </w:pPr>
-      <w:r>
-        <w:rPr>
-          <w:rFonts w:ascii="Times New Roman" w:eastAsia="Times New Roman" w:hAnsi="Times New Roman" w:cs="Times New Roman"/>
+          <w:rFonts w:eastAsia="Times New Roman" w:cs="Times New Roman"/>
+          <w:kern w:val="0"/>
+          <w:lang w:eastAsia="fr-FR"/>
+          <w14:ligatures w14:val="none"/>
+        </w:rPr>
+      </w:pPr>
+      <w:r>
+        <w:rPr>
+          <w:rFonts w:eastAsia="Times New Roman" w:cs="Times New Roman"/>
           <w:i/>
           <w:iCs/>
           <w:kern w:val="0"/>
@@ -1300,7 +1300,7 @@
       </w:r>
       <w:r>
         <w:rPr>
-          <w:rFonts w:ascii="Times New Roman" w:eastAsia="Times New Roman" w:hAnsi="Times New Roman" w:cs="Times New Roman"/>
+          <w:rFonts w:eastAsia="Times New Roman" w:cs="Times New Roman"/>
           <w:kern w:val="0"/>
           <w:lang w:eastAsia="fr-FR"/>
           <w14:ligatures w14:val="none"/>
@@ -1309,7 +1309,7 @@
       </w:r>
       <w:r>
         <w:rPr>
-          <w:rFonts w:ascii="Times New Roman" w:eastAsia="Times New Roman" w:hAnsi="Times New Roman" w:cs="Times New Roman"/>
+          <w:rFonts w:eastAsia="Times New Roman" w:cs="Times New Roman"/>
           <w:b/>
           <w:bCs/>
           <w:kern w:val="0"/>
@@ -1320,7 +1320,7 @@
       </w:r>
       <w:r>
         <w:rPr>
-          <w:rFonts w:ascii="Times New Roman" w:eastAsia="Times New Roman" w:hAnsi="Times New Roman" w:cs="Times New Roman"/>
+          <w:rFonts w:eastAsia="Times New Roman" w:cs="Times New Roman"/>
           <w:kern w:val="0"/>
           <w:lang w:eastAsia="fr-FR"/>
           <w14:ligatures w14:val="none"/>
@@ -1336,15 +1336,15 @@
         </w:numPr>
         <w:spacing w:before="100" w:beforeAutospacing="1" w:after="100" w:afterAutospacing="1" w:line="240" w:lineRule="auto"/>
         <w:rPr>
-          <w:rFonts w:ascii="Times New Roman" w:eastAsia="Times New Roman" w:hAnsi="Times New Roman" w:cs="Times New Roman"/>
-          <w:kern w:val="0"/>
-          <w:lang w:eastAsia="fr-FR"/>
-          <w14:ligatures w14:val="none"/>
-        </w:rPr>
-      </w:pPr>
-      <w:r>
-        <w:rPr>
-          <w:rFonts w:ascii="Times New Roman" w:eastAsia="Times New Roman" w:hAnsi="Times New Roman" w:cs="Times New Roman"/>
+          <w:rFonts w:eastAsia="Times New Roman" w:cs="Times New Roman"/>
+          <w:kern w:val="0"/>
+          <w:lang w:eastAsia="fr-FR"/>
+          <w14:ligatures w14:val="none"/>
+        </w:rPr>
+      </w:pPr>
+      <w:r>
+        <w:rPr>
+          <w:rFonts w:eastAsia="Times New Roman" w:cs="Times New Roman"/>
           <w:b/>
           <w:bCs/>
           <w:kern w:val="0"/>
@@ -1356,7 +1356,7 @@
       <w:proofErr w:type="spellStart"/>
       <w:r>
         <w:rPr>
-          <w:rFonts w:ascii="Times New Roman" w:eastAsia="Times New Roman" w:hAnsi="Times New Roman" w:cs="Times New Roman"/>
+          <w:rFonts w:eastAsia="Times New Roman" w:cs="Times New Roman"/>
           <w:b/>
           <w:bCs/>
           <w:kern w:val="0"/>
@@ -1368,7 +1368,7 @@
       <w:proofErr w:type="spellEnd"/>
       <w:r>
         <w:rPr>
-          <w:rFonts w:ascii="Times New Roman" w:eastAsia="Times New Roman" w:hAnsi="Times New Roman" w:cs="Times New Roman"/>
+          <w:rFonts w:eastAsia="Times New Roman" w:cs="Times New Roman"/>
           <w:b/>
           <w:bCs/>
           <w:kern w:val="0"/>
@@ -1379,7 +1379,7 @@
       </w:r>
       <w:r>
         <w:rPr>
-          <w:rFonts w:ascii="Courier New" w:eastAsia="Times New Roman" w:hAnsi="Courier New" w:cs="Courier New"/>
+          <w:rFonts w:eastAsia="Times New Roman" w:cs="Courier New"/>
           <w:b/>
           <w:bCs/>
           <w:kern w:val="0"/>
@@ -1392,7 +1392,7 @@
       </w:r>
       <w:r>
         <w:rPr>
-          <w:rFonts w:ascii="Times New Roman" w:eastAsia="Times New Roman" w:hAnsi="Times New Roman" w:cs="Times New Roman"/>
+          <w:rFonts w:eastAsia="Times New Roman" w:cs="Times New Roman"/>
           <w:b/>
           <w:bCs/>
           <w:kern w:val="0"/>
@@ -1410,15 +1410,15 @@
         </w:numPr>
         <w:spacing w:before="100" w:beforeAutospacing="1" w:after="100" w:afterAutospacing="1" w:line="240" w:lineRule="auto"/>
         <w:rPr>
-          <w:rFonts w:ascii="Times New Roman" w:eastAsia="Times New Roman" w:hAnsi="Times New Roman" w:cs="Times New Roman"/>
-          <w:kern w:val="0"/>
-          <w:lang w:eastAsia="fr-FR"/>
-          <w14:ligatures w14:val="none"/>
-        </w:rPr>
-      </w:pPr>
-      <w:r>
-        <w:rPr>
-          <w:rFonts w:ascii="Times New Roman" w:eastAsia="Times New Roman" w:hAnsi="Times New Roman" w:cs="Times New Roman"/>
+          <w:rFonts w:eastAsia="Times New Roman" w:cs="Times New Roman"/>
+          <w:kern w:val="0"/>
+          <w:lang w:eastAsia="fr-FR"/>
+          <w14:ligatures w14:val="none"/>
+        </w:rPr>
+      </w:pPr>
+      <w:r>
+        <w:rPr>
+          <w:rFonts w:eastAsia="Times New Roman" w:cs="Times New Roman"/>
           <w:i/>
           <w:iCs/>
           <w:kern w:val="0"/>
@@ -1429,7 +1429,7 @@
       </w:r>
       <w:r>
         <w:rPr>
-          <w:rFonts w:ascii="Times New Roman" w:eastAsia="Times New Roman" w:hAnsi="Times New Roman" w:cs="Times New Roman"/>
+          <w:rFonts w:eastAsia="Times New Roman" w:cs="Times New Roman"/>
           <w:kern w:val="0"/>
           <w:lang w:eastAsia="fr-FR"/>
           <w14:ligatures w14:val="none"/>
@@ -1445,15 +1445,15 @@
         </w:numPr>
         <w:spacing w:before="100" w:beforeAutospacing="1" w:after="100" w:afterAutospacing="1" w:line="240" w:lineRule="auto"/>
         <w:rPr>
-          <w:rFonts w:ascii="Times New Roman" w:eastAsia="Times New Roman" w:hAnsi="Times New Roman" w:cs="Times New Roman"/>
-          <w:kern w:val="0"/>
-          <w:lang w:eastAsia="fr-FR"/>
-          <w14:ligatures w14:val="none"/>
-        </w:rPr>
-      </w:pPr>
-      <w:r>
-        <w:rPr>
-          <w:rFonts w:ascii="Times New Roman" w:eastAsia="Times New Roman" w:hAnsi="Times New Roman" w:cs="Times New Roman"/>
+          <w:rFonts w:eastAsia="Times New Roman" w:cs="Times New Roman"/>
+          <w:kern w:val="0"/>
+          <w:lang w:eastAsia="fr-FR"/>
+          <w14:ligatures w14:val="none"/>
+        </w:rPr>
+      </w:pPr>
+      <w:r>
+        <w:rPr>
+          <w:rFonts w:eastAsia="Times New Roman" w:cs="Times New Roman"/>
           <w:b/>
           <w:bCs/>
           <w:kern w:val="0"/>
@@ -1465,7 +1465,7 @@
       <w:proofErr w:type="spellStart"/>
       <w:r>
         <w:rPr>
-          <w:rFonts w:ascii="Times New Roman" w:eastAsia="Times New Roman" w:hAnsi="Times New Roman" w:cs="Times New Roman"/>
+          <w:rFonts w:eastAsia="Times New Roman" w:cs="Times New Roman"/>
           <w:b/>
           <w:bCs/>
           <w:kern w:val="0"/>
@@ -1477,7 +1477,7 @@
       <w:proofErr w:type="spellEnd"/>
       <w:r>
         <w:rPr>
-          <w:rFonts w:ascii="Times New Roman" w:eastAsia="Times New Roman" w:hAnsi="Times New Roman" w:cs="Times New Roman"/>
+          <w:rFonts w:eastAsia="Times New Roman" w:cs="Times New Roman"/>
           <w:b/>
           <w:bCs/>
           <w:kern w:val="0"/>
@@ -1495,15 +1495,15 @@
         </w:numPr>
         <w:spacing w:before="100" w:beforeAutospacing="1" w:after="100" w:afterAutospacing="1" w:line="240" w:lineRule="auto"/>
         <w:rPr>
-          <w:rFonts w:ascii="Times New Roman" w:eastAsia="Times New Roman" w:hAnsi="Times New Roman" w:cs="Times New Roman"/>
-          <w:kern w:val="0"/>
-          <w:lang w:eastAsia="fr-FR"/>
-          <w14:ligatures w14:val="none"/>
-        </w:rPr>
-      </w:pPr>
-      <w:r>
-        <w:rPr>
-          <w:rFonts w:ascii="Times New Roman" w:eastAsia="Times New Roman" w:hAnsi="Times New Roman" w:cs="Times New Roman"/>
+          <w:rFonts w:eastAsia="Times New Roman" w:cs="Times New Roman"/>
+          <w:kern w:val="0"/>
+          <w:lang w:eastAsia="fr-FR"/>
+          <w14:ligatures w14:val="none"/>
+        </w:rPr>
+      </w:pPr>
+      <w:r>
+        <w:rPr>
+          <w:rFonts w:eastAsia="Times New Roman" w:cs="Times New Roman"/>
           <w:i/>
           <w:iCs/>
           <w:kern w:val="0"/>
@@ -1514,7 +1514,7 @@
       </w:r>
       <w:r>
         <w:rPr>
-          <w:rFonts w:ascii="Times New Roman" w:eastAsia="Times New Roman" w:hAnsi="Times New Roman" w:cs="Times New Roman"/>
+          <w:rFonts w:eastAsia="Times New Roman" w:cs="Times New Roman"/>
           <w:kern w:val="0"/>
           <w:lang w:eastAsia="fr-FR"/>
           <w14:ligatures w14:val="none"/>
@@ -1523,7 +1523,7 @@
       </w:r>
       <w:r>
         <w:rPr>
-          <w:rFonts w:ascii="Times New Roman" w:eastAsia="Times New Roman" w:hAnsi="Times New Roman" w:cs="Times New Roman"/>
+          <w:rFonts w:eastAsia="Times New Roman" w:cs="Times New Roman"/>
           <w:b/>
           <w:bCs/>
           <w:kern w:val="0"/>
@@ -1534,7 +1534,7 @@
       </w:r>
       <w:r>
         <w:rPr>
-          <w:rFonts w:ascii="Times New Roman" w:eastAsia="Times New Roman" w:hAnsi="Times New Roman" w:cs="Times New Roman"/>
+          <w:rFonts w:eastAsia="Times New Roman" w:cs="Times New Roman"/>
           <w:kern w:val="0"/>
           <w:lang w:eastAsia="fr-FR"/>
           <w14:ligatures w14:val="none"/>
@@ -1550,15 +1550,15 @@
         </w:numPr>
         <w:spacing w:before="100" w:beforeAutospacing="1" w:after="100" w:afterAutospacing="1" w:line="240" w:lineRule="auto"/>
         <w:rPr>
-          <w:rFonts w:ascii="Times New Roman" w:eastAsia="Times New Roman" w:hAnsi="Times New Roman" w:cs="Times New Roman"/>
-          <w:kern w:val="0"/>
-          <w:lang w:eastAsia="fr-FR"/>
-          <w14:ligatures w14:val="none"/>
-        </w:rPr>
-      </w:pPr>
-      <w:r>
-        <w:rPr>
-          <w:rFonts w:ascii="Times New Roman" w:eastAsia="Times New Roman" w:hAnsi="Times New Roman" w:cs="Times New Roman"/>
+          <w:rFonts w:eastAsia="Times New Roman" w:cs="Times New Roman"/>
+          <w:kern w:val="0"/>
+          <w:lang w:eastAsia="fr-FR"/>
+          <w14:ligatures w14:val="none"/>
+        </w:rPr>
+      </w:pPr>
+      <w:r>
+        <w:rPr>
+          <w:rFonts w:eastAsia="Times New Roman" w:cs="Times New Roman"/>
           <w:i/>
           <w:iCs/>
           <w:kern w:val="0"/>
@@ -1570,7 +1570,7 @@
       <w:proofErr w:type="spellStart"/>
       <w:r>
         <w:rPr>
-          <w:rFonts w:ascii="Times New Roman" w:eastAsia="Times New Roman" w:hAnsi="Times New Roman" w:cs="Times New Roman"/>
+          <w:rFonts w:eastAsia="Times New Roman" w:cs="Times New Roman"/>
           <w:i/>
           <w:iCs/>
           <w:kern w:val="0"/>
@@ -1582,7 +1582,7 @@
       <w:proofErr w:type="spellEnd"/>
       <w:r>
         <w:rPr>
-          <w:rFonts w:ascii="Times New Roman" w:eastAsia="Times New Roman" w:hAnsi="Times New Roman" w:cs="Times New Roman"/>
+          <w:rFonts w:eastAsia="Times New Roman" w:cs="Times New Roman"/>
           <w:i/>
           <w:iCs/>
           <w:kern w:val="0"/>
@@ -1593,7 +1593,7 @@
       </w:r>
       <w:r>
         <w:rPr>
-          <w:rFonts w:ascii="Times New Roman" w:eastAsia="Times New Roman" w:hAnsi="Times New Roman" w:cs="Times New Roman"/>
+          <w:rFonts w:eastAsia="Times New Roman" w:cs="Times New Roman"/>
           <w:kern w:val="0"/>
           <w:lang w:eastAsia="fr-FR"/>
           <w14:ligatures w14:val="none"/>
@@ -1603,7 +1603,7 @@
       <w:proofErr w:type="spellStart"/>
       <w:r>
         <w:rPr>
-          <w:rFonts w:ascii="Courier New" w:eastAsia="Times New Roman" w:hAnsi="Courier New" w:cs="Courier New"/>
+          <w:rFonts w:eastAsia="Times New Roman" w:cs="Courier New"/>
           <w:kern w:val="0"/>
           <w:sz w:val="20"/>
           <w:szCs w:val="20"/>
@@ -1615,7 +1615,7 @@
       <w:proofErr w:type="spellEnd"/>
       <w:r>
         <w:rPr>
-          <w:rFonts w:ascii="Courier New" w:eastAsia="Times New Roman" w:hAnsi="Courier New" w:cs="Courier New"/>
+          <w:rFonts w:eastAsia="Times New Roman" w:cs="Courier New"/>
           <w:kern w:val="0"/>
           <w:sz w:val="20"/>
           <w:szCs w:val="20"/>
@@ -1626,7 +1626,7 @@
       </w:r>
       <w:r>
         <w:rPr>
-          <w:rFonts w:ascii="Times New Roman" w:eastAsia="Times New Roman" w:hAnsi="Times New Roman" w:cs="Times New Roman"/>
+          <w:rFonts w:eastAsia="Times New Roman" w:cs="Times New Roman"/>
           <w:kern w:val="0"/>
           <w:lang w:eastAsia="fr-FR"/>
           <w14:ligatures w14:val="none"/>
@@ -1636,7 +1636,7 @@
       <w:proofErr w:type="spellStart"/>
       <w:r>
         <w:rPr>
-          <w:rFonts w:ascii="Courier New" w:eastAsia="Times New Roman" w:hAnsi="Courier New" w:cs="Courier New"/>
+          <w:rFonts w:eastAsia="Times New Roman" w:cs="Courier New"/>
           <w:kern w:val="0"/>
           <w:sz w:val="20"/>
           <w:szCs w:val="20"/>
@@ -1648,7 +1648,7 @@
       <w:proofErr w:type="spellEnd"/>
       <w:r>
         <w:rPr>
-          <w:rFonts w:ascii="Courier New" w:eastAsia="Times New Roman" w:hAnsi="Courier New" w:cs="Courier New"/>
+          <w:rFonts w:eastAsia="Times New Roman" w:cs="Courier New"/>
           <w:kern w:val="0"/>
           <w:sz w:val="20"/>
           <w:szCs w:val="20"/>
@@ -1659,7 +1659,7 @@
       </w:r>
       <w:r>
         <w:rPr>
-          <w:rFonts w:ascii="Times New Roman" w:eastAsia="Times New Roman" w:hAnsi="Times New Roman" w:cs="Times New Roman"/>
+          <w:rFonts w:eastAsia="Times New Roman" w:cs="Times New Roman"/>
           <w:kern w:val="0"/>
           <w:lang w:eastAsia="fr-FR"/>
           <w14:ligatures w14:val="none"/>
@@ -1670,7 +1670,7 @@
       <w:proofErr w:type="gramStart"/>
       <w:r>
         <w:rPr>
-          <w:rFonts w:ascii="Courier New" w:eastAsia="Times New Roman" w:hAnsi="Courier New" w:cs="Courier New"/>
+          <w:rFonts w:eastAsia="Times New Roman" w:cs="Courier New"/>
           <w:kern w:val="0"/>
           <w:sz w:val="20"/>
           <w:szCs w:val="20"/>
@@ -1682,7 +1682,7 @@
       <w:proofErr w:type="spellEnd"/>
       <w:r>
         <w:rPr>
-          <w:rFonts w:ascii="Courier New" w:eastAsia="Times New Roman" w:hAnsi="Courier New" w:cs="Courier New"/>
+          <w:rFonts w:eastAsia="Times New Roman" w:cs="Courier New"/>
           <w:kern w:val="0"/>
           <w:sz w:val="20"/>
           <w:szCs w:val="20"/>
@@ -1694,7 +1694,7 @@
       <w:proofErr w:type="gramEnd"/>
       <w:r>
         <w:rPr>
-          <w:rFonts w:ascii="Courier New" w:eastAsia="Times New Roman" w:hAnsi="Courier New" w:cs="Courier New"/>
+          <w:rFonts w:eastAsia="Times New Roman" w:cs="Courier New"/>
           <w:kern w:val="0"/>
           <w:sz w:val="20"/>
           <w:szCs w:val="20"/>
@@ -1705,7 +1705,7 @@
       </w:r>
       <w:r>
         <w:rPr>
-          <w:rFonts w:ascii="Times New Roman" w:eastAsia="Times New Roman" w:hAnsi="Times New Roman" w:cs="Times New Roman"/>
+          <w:rFonts w:eastAsia="Times New Roman" w:cs="Times New Roman"/>
           <w:kern w:val="0"/>
           <w:lang w:eastAsia="fr-FR"/>
           <w14:ligatures w14:val="none"/>
@@ -1721,15 +1721,15 @@
         </w:numPr>
         <w:spacing w:before="100" w:beforeAutospacing="1" w:after="100" w:afterAutospacing="1" w:line="240" w:lineRule="auto"/>
         <w:rPr>
-          <w:rFonts w:ascii="Times New Roman" w:eastAsia="Times New Roman" w:hAnsi="Times New Roman" w:cs="Times New Roman"/>
-          <w:kern w:val="0"/>
-          <w:lang w:eastAsia="fr-FR"/>
-          <w14:ligatures w14:val="none"/>
-        </w:rPr>
-      </w:pPr>
-      <w:r>
-        <w:rPr>
-          <w:rFonts w:ascii="Times New Roman" w:eastAsia="Times New Roman" w:hAnsi="Times New Roman" w:cs="Times New Roman"/>
+          <w:rFonts w:eastAsia="Times New Roman" w:cs="Times New Roman"/>
+          <w:kern w:val="0"/>
+          <w:lang w:eastAsia="fr-FR"/>
+          <w14:ligatures w14:val="none"/>
+        </w:rPr>
+      </w:pPr>
+      <w:r>
+        <w:rPr>
+          <w:rFonts w:eastAsia="Times New Roman" w:cs="Times New Roman"/>
           <w:b/>
           <w:bCs/>
           <w:kern w:val="0"/>
@@ -1741,7 +1741,7 @@
       <w:proofErr w:type="spellStart"/>
       <w:r>
         <w:rPr>
-          <w:rFonts w:ascii="Times New Roman" w:eastAsia="Times New Roman" w:hAnsi="Times New Roman" w:cs="Times New Roman"/>
+          <w:rFonts w:eastAsia="Times New Roman" w:cs="Times New Roman"/>
           <w:b/>
           <w:bCs/>
           <w:kern w:val="0"/>
@@ -1753,7 +1753,7 @@
       <w:proofErr w:type="spellEnd"/>
       <w:r>
         <w:rPr>
-          <w:rFonts w:ascii="Times New Roman" w:eastAsia="Times New Roman" w:hAnsi="Times New Roman" w:cs="Times New Roman"/>
+          <w:rFonts w:eastAsia="Times New Roman" w:cs="Times New Roman"/>
           <w:b/>
           <w:bCs/>
           <w:kern w:val="0"/>
@@ -1771,15 +1771,15 @@
         </w:numPr>
         <w:spacing w:before="100" w:beforeAutospacing="1" w:after="100" w:afterAutospacing="1" w:line="240" w:lineRule="auto"/>
         <w:rPr>
-          <w:rFonts w:ascii="Times New Roman" w:eastAsia="Times New Roman" w:hAnsi="Times New Roman" w:cs="Times New Roman"/>
-          <w:kern w:val="0"/>
-          <w:lang w:eastAsia="fr-FR"/>
-          <w14:ligatures w14:val="none"/>
-        </w:rPr>
-      </w:pPr>
-      <w:r>
-        <w:rPr>
-          <w:rFonts w:ascii="Times New Roman" w:eastAsia="Times New Roman" w:hAnsi="Times New Roman" w:cs="Times New Roman"/>
+          <w:rFonts w:eastAsia="Times New Roman" w:cs="Times New Roman"/>
+          <w:kern w:val="0"/>
+          <w:lang w:eastAsia="fr-FR"/>
+          <w14:ligatures w14:val="none"/>
+        </w:rPr>
+      </w:pPr>
+      <w:r>
+        <w:rPr>
+          <w:rFonts w:eastAsia="Times New Roman" w:cs="Times New Roman"/>
           <w:kern w:val="0"/>
           <w:lang w:eastAsia="fr-FR"/>
           <w14:ligatures w14:val="none"/>
@@ -1788,7 +1788,7 @@
       </w:r>
       <w:r>
         <w:rPr>
-          <w:rFonts w:ascii="Courier New" w:eastAsia="Times New Roman" w:hAnsi="Courier New" w:cs="Courier New"/>
+          <w:rFonts w:eastAsia="Times New Roman" w:cs="Courier New"/>
           <w:kern w:val="0"/>
           <w:sz w:val="20"/>
           <w:szCs w:val="20"/>
@@ -1799,7 +1799,7 @@
       </w:r>
       <w:r>
         <w:rPr>
-          <w:rFonts w:ascii="Times New Roman" w:eastAsia="Times New Roman" w:hAnsi="Times New Roman" w:cs="Times New Roman"/>
+          <w:rFonts w:eastAsia="Times New Roman" w:cs="Times New Roman"/>
           <w:kern w:val="0"/>
           <w:lang w:eastAsia="fr-FR"/>
           <w14:ligatures w14:val="none"/>
@@ -1808,7 +1808,7 @@
       </w:r>
       <w:r>
         <w:rPr>
-          <w:rFonts w:ascii="Courier New" w:eastAsia="Times New Roman" w:hAnsi="Courier New" w:cs="Courier New"/>
+          <w:rFonts w:eastAsia="Times New Roman" w:cs="Courier New"/>
           <w:kern w:val="0"/>
           <w:sz w:val="20"/>
           <w:szCs w:val="20"/>
@@ -1819,7 +1819,7 @@
       </w:r>
       <w:r>
         <w:rPr>
-          <w:rFonts w:ascii="Times New Roman" w:eastAsia="Times New Roman" w:hAnsi="Times New Roman" w:cs="Times New Roman"/>
+          <w:rFonts w:eastAsia="Times New Roman" w:cs="Times New Roman"/>
           <w:kern w:val="0"/>
           <w:lang w:eastAsia="fr-FR"/>
           <w14:ligatures w14:val="none"/>
@@ -1828,7 +1828,7 @@
       </w:r>
       <w:r>
         <w:rPr>
-          <w:rFonts w:ascii="Courier New" w:eastAsia="Times New Roman" w:hAnsi="Courier New" w:cs="Courier New"/>
+          <w:rFonts w:eastAsia="Times New Roman" w:cs="Courier New"/>
           <w:kern w:val="0"/>
           <w:sz w:val="20"/>
           <w:szCs w:val="20"/>
@@ -1839,7 +1839,7 @@
       </w:r>
       <w:r>
         <w:rPr>
-          <w:rFonts w:ascii="Times New Roman" w:eastAsia="Times New Roman" w:hAnsi="Times New Roman" w:cs="Times New Roman"/>
+          <w:rFonts w:eastAsia="Times New Roman" w:cs="Times New Roman"/>
           <w:kern w:val="0"/>
           <w:lang w:eastAsia="fr-FR"/>
           <w14:ligatures w14:val="none"/>
@@ -1852,7 +1852,7 @@
         <w:spacing w:before="100" w:beforeAutospacing="1" w:after="100" w:afterAutospacing="1" w:line="240" w:lineRule="auto"/>
         <w:outlineLvl w:val="1"/>
         <w:rPr>
-          <w:rFonts w:ascii="Times New Roman" w:eastAsia="Times New Roman" w:hAnsi="Times New Roman" w:cs="Times New Roman"/>
+          <w:rFonts w:eastAsia="Times New Roman" w:cs="Times New Roman"/>
           <w:b/>
           <w:bCs/>
           <w:kern w:val="0"/>
@@ -1877,7 +1877,7 @@
       </w:r>
       <w:r>
         <w:rPr>
-          <w:rFonts w:ascii="Times New Roman" w:eastAsia="Times New Roman" w:hAnsi="Times New Roman" w:cs="Times New Roman"/>
+          <w:rFonts w:eastAsia="Times New Roman" w:cs="Times New Roman"/>
           <w:b/>
           <w:bCs/>
           <w:kern w:val="0"/>
@@ -1893,15 +1893,15 @@
       <w:pPr>
         <w:spacing w:before="100" w:beforeAutospacing="1" w:after="100" w:afterAutospacing="1" w:line="240" w:lineRule="auto"/>
         <w:rPr>
-          <w:rFonts w:ascii="Times New Roman" w:eastAsia="Times New Roman" w:hAnsi="Times New Roman" w:cs="Times New Roman"/>
-          <w:kern w:val="0"/>
-          <w:lang w:eastAsia="fr-FR"/>
-          <w14:ligatures w14:val="none"/>
-        </w:rPr>
-      </w:pPr>
-      <w:r>
-        <w:rPr>
-          <w:rFonts w:ascii="Times New Roman" w:eastAsia="Times New Roman" w:hAnsi="Times New Roman" w:cs="Times New Roman"/>
+          <w:rFonts w:eastAsia="Times New Roman" w:cs="Times New Roman"/>
+          <w:kern w:val="0"/>
+          <w:lang w:eastAsia="fr-FR"/>
+          <w14:ligatures w14:val="none"/>
+        </w:rPr>
+      </w:pPr>
+      <w:r>
+        <w:rPr>
+          <w:rFonts w:eastAsia="Times New Roman" w:cs="Times New Roman"/>
           <w:i/>
           <w:iCs/>
           <w:kern w:val="0"/>
@@ -1915,15 +1915,15 @@
       <w:pPr>
         <w:spacing w:before="100" w:beforeAutospacing="1" w:after="100" w:afterAutospacing="1" w:line="240" w:lineRule="auto"/>
         <w:rPr>
-          <w:rFonts w:ascii="Times New Roman" w:eastAsia="Times New Roman" w:hAnsi="Times New Roman" w:cs="Times New Roman"/>
-          <w:kern w:val="0"/>
-          <w:lang w:eastAsia="fr-FR"/>
-          <w14:ligatures w14:val="none"/>
-        </w:rPr>
-      </w:pPr>
-      <w:r>
-        <w:rPr>
-          <w:rFonts w:ascii="Times New Roman" w:eastAsia="Times New Roman" w:hAnsi="Times New Roman" w:cs="Times New Roman"/>
+          <w:rFonts w:eastAsia="Times New Roman" w:cs="Times New Roman"/>
+          <w:kern w:val="0"/>
+          <w:lang w:eastAsia="fr-FR"/>
+          <w14:ligatures w14:val="none"/>
+        </w:rPr>
+      </w:pPr>
+      <w:r>
+        <w:rPr>
+          <w:rFonts w:eastAsia="Times New Roman" w:cs="Times New Roman"/>
           <w:b/>
           <w:bCs/>
           <w:kern w:val="0"/>
@@ -1934,7 +1934,7 @@
       </w:r>
       <w:r>
         <w:rPr>
-          <w:rFonts w:ascii="Times New Roman" w:eastAsia="Times New Roman" w:hAnsi="Times New Roman" w:cs="Times New Roman"/>
+          <w:rFonts w:eastAsia="Times New Roman" w:cs="Times New Roman"/>
           <w:kern w:val="0"/>
           <w:lang w:eastAsia="fr-FR"/>
           <w14:ligatures w14:val="none"/>
@@ -1944,7 +1944,7 @@
       <w:proofErr w:type="spellStart"/>
       <w:r>
         <w:rPr>
-          <w:rFonts w:ascii="Times New Roman" w:eastAsia="Times New Roman" w:hAnsi="Times New Roman" w:cs="Times New Roman"/>
+          <w:rFonts w:eastAsia="Times New Roman" w:cs="Times New Roman"/>
           <w:kern w:val="0"/>
           <w:lang w:eastAsia="fr-FR"/>
           <w14:ligatures w14:val="none"/>
@@ -1954,7 +1954,7 @@
       <w:proofErr w:type="spellEnd"/>
       <w:r>
         <w:rPr>
-          <w:rFonts w:ascii="Times New Roman" w:eastAsia="Times New Roman" w:hAnsi="Times New Roman" w:cs="Times New Roman"/>
+          <w:rFonts w:eastAsia="Times New Roman" w:cs="Times New Roman"/>
           <w:kern w:val="0"/>
           <w:lang w:eastAsia="fr-FR"/>
           <w14:ligatures w14:val="none"/>
@@ -1964,7 +1964,7 @@
       <w:proofErr w:type="gramStart"/>
       <w:r>
         <w:rPr>
-          <w:rFonts w:ascii="Times New Roman" w:eastAsia="Times New Roman" w:hAnsi="Times New Roman" w:cs="Times New Roman"/>
+          <w:rFonts w:eastAsia="Times New Roman" w:cs="Times New Roman"/>
           <w:kern w:val="0"/>
           <w:lang w:eastAsia="fr-FR"/>
           <w14:ligatures w14:val="none"/>
@@ -1974,7 +1974,7 @@
       <w:proofErr w:type="gramEnd"/>
       <w:r>
         <w:rPr>
-          <w:rFonts w:ascii="Times New Roman" w:eastAsia="Times New Roman" w:hAnsi="Times New Roman" w:cs="Times New Roman"/>
+          <w:rFonts w:eastAsia="Times New Roman" w:cs="Times New Roman"/>
           <w:kern w:val="0"/>
           <w:lang w:eastAsia="fr-FR"/>
           <w14:ligatures w14:val="none"/>
@@ -1984,7 +1984,7 @@
       <w:proofErr w:type="spellStart"/>
       <w:r>
         <w:rPr>
-          <w:rFonts w:ascii="Times New Roman" w:eastAsia="Times New Roman" w:hAnsi="Times New Roman" w:cs="Times New Roman"/>
+          <w:rFonts w:eastAsia="Times New Roman" w:cs="Times New Roman"/>
           <w:kern w:val="0"/>
           <w:lang w:eastAsia="fr-FR"/>
           <w14:ligatures w14:val="none"/>
@@ -1994,7 +1994,7 @@
       <w:proofErr w:type="spellEnd"/>
       <w:r>
         <w:rPr>
-          <w:rFonts w:ascii="Times New Roman" w:eastAsia="Times New Roman" w:hAnsi="Times New Roman" w:cs="Times New Roman"/>
+          <w:rFonts w:eastAsia="Times New Roman" w:cs="Times New Roman"/>
           <w:kern w:val="0"/>
           <w:lang w:eastAsia="fr-FR"/>
           <w14:ligatures w14:val="none"/>
@@ -2006,15 +2006,15 @@
       <w:pPr>
         <w:spacing w:before="100" w:beforeAutospacing="1" w:after="100" w:afterAutospacing="1" w:line="240" w:lineRule="auto"/>
         <w:rPr>
-          <w:rFonts w:ascii="Times New Roman" w:eastAsia="Times New Roman" w:hAnsi="Times New Roman" w:cs="Times New Roman"/>
-          <w:kern w:val="0"/>
-          <w:lang w:eastAsia="fr-FR"/>
-          <w14:ligatures w14:val="none"/>
-        </w:rPr>
-      </w:pPr>
-      <w:r>
-        <w:rPr>
-          <w:rFonts w:ascii="Times New Roman" w:eastAsia="Times New Roman" w:hAnsi="Times New Roman" w:cs="Times New Roman"/>
+          <w:rFonts w:eastAsia="Times New Roman" w:cs="Times New Roman"/>
+          <w:kern w:val="0"/>
+          <w:lang w:eastAsia="fr-FR"/>
+          <w14:ligatures w14:val="none"/>
+        </w:rPr>
+      </w:pPr>
+      <w:r>
+        <w:rPr>
+          <w:rFonts w:eastAsia="Times New Roman" w:cs="Times New Roman"/>
           <w:b/>
           <w:bCs/>
           <w:kern w:val="0"/>
@@ -2025,7 +2025,7 @@
       </w:r>
       <w:r>
         <w:rPr>
-          <w:rFonts w:ascii="Times New Roman" w:eastAsia="Times New Roman" w:hAnsi="Times New Roman" w:cs="Times New Roman"/>
+          <w:rFonts w:eastAsia="Times New Roman" w:cs="Times New Roman"/>
           <w:kern w:val="0"/>
           <w:lang w:eastAsia="fr-FR"/>
           <w14:ligatures w14:val="none"/>
@@ -2034,7 +2034,7 @@
       </w:r>
       <w:r>
         <w:rPr>
-          <w:rFonts w:ascii="Times New Roman" w:eastAsia="Times New Roman" w:hAnsi="Times New Roman" w:cs="Times New Roman"/>
+          <w:rFonts w:eastAsia="Times New Roman" w:cs="Times New Roman"/>
           <w:b/>
           <w:bCs/>
           <w:kern w:val="0"/>
@@ -2048,15 +2048,15 @@
       <w:pPr>
         <w:spacing w:before="100" w:beforeAutospacing="1" w:after="100" w:afterAutospacing="1" w:line="240" w:lineRule="auto"/>
         <w:rPr>
-          <w:rFonts w:ascii="Times New Roman" w:eastAsia="Times New Roman" w:hAnsi="Times New Roman" w:cs="Times New Roman"/>
-          <w:kern w:val="0"/>
-          <w:lang w:eastAsia="fr-FR"/>
-          <w14:ligatures w14:val="none"/>
-        </w:rPr>
-      </w:pPr>
-      <w:r>
-        <w:rPr>
-          <w:rFonts w:ascii="Times New Roman" w:eastAsia="Times New Roman" w:hAnsi="Times New Roman" w:cs="Times New Roman"/>
+          <w:rFonts w:eastAsia="Times New Roman" w:cs="Times New Roman"/>
+          <w:kern w:val="0"/>
+          <w:lang w:eastAsia="fr-FR"/>
+          <w14:ligatures w14:val="none"/>
+        </w:rPr>
+      </w:pPr>
+      <w:r>
+        <w:rPr>
+          <w:rFonts w:eastAsia="Times New Roman" w:cs="Times New Roman"/>
           <w:b/>
           <w:bCs/>
           <w:kern w:val="0"/>
@@ -2068,7 +2068,7 @@
       <w:proofErr w:type="spellStart"/>
       <w:r>
         <w:rPr>
-          <w:rFonts w:ascii="Times New Roman" w:eastAsia="Times New Roman" w:hAnsi="Times New Roman" w:cs="Times New Roman"/>
+          <w:rFonts w:eastAsia="Times New Roman" w:cs="Times New Roman"/>
           <w:b/>
           <w:bCs/>
           <w:kern w:val="0"/>
@@ -2080,7 +2080,7 @@
       <w:proofErr w:type="spellEnd"/>
       <w:r>
         <w:rPr>
-          <w:rFonts w:ascii="Times New Roman" w:eastAsia="Times New Roman" w:hAnsi="Times New Roman" w:cs="Times New Roman"/>
+          <w:rFonts w:eastAsia="Times New Roman" w:cs="Times New Roman"/>
           <w:b/>
           <w:bCs/>
           <w:kern w:val="0"/>
@@ -2091,7 +2091,7 @@
       </w:r>
       <w:r>
         <w:rPr>
-          <w:rFonts w:ascii="Times New Roman" w:eastAsia="Times New Roman" w:hAnsi="Times New Roman" w:cs="Times New Roman"/>
+          <w:rFonts w:eastAsia="Times New Roman" w:cs="Times New Roman"/>
           <w:kern w:val="0"/>
           <w:lang w:eastAsia="fr-FR"/>
           <w14:ligatures w14:val="none"/>
@@ -2107,7 +2107,7 @@
         </w:numPr>
         <w:spacing w:before="100" w:beforeAutospacing="1" w:after="100" w:afterAutospacing="1" w:line="240" w:lineRule="auto"/>
         <w:rPr>
-          <w:rFonts w:ascii="Times New Roman" w:eastAsia="Times New Roman" w:hAnsi="Times New Roman" w:cs="Times New Roman"/>
+          <w:rFonts w:eastAsia="Times New Roman" w:cs="Times New Roman"/>
           <w:kern w:val="0"/>
           <w:lang w:eastAsia="fr-FR"/>
           <w14:ligatures w14:val="none"/>
@@ -2116,7 +2116,7 @@
       <w:proofErr w:type="gramStart"/>
       <w:r>
         <w:rPr>
-          <w:rFonts w:ascii="Times New Roman" w:eastAsia="Times New Roman" w:hAnsi="Times New Roman" w:cs="Times New Roman"/>
+          <w:rFonts w:eastAsia="Times New Roman" w:cs="Times New Roman"/>
           <w:b/>
           <w:bCs/>
           <w:kern w:val="0"/>
@@ -2128,7 +2128,7 @@
       <w:proofErr w:type="gramEnd"/>
       <w:r>
         <w:rPr>
-          <w:rFonts w:ascii="Times New Roman" w:eastAsia="Times New Roman" w:hAnsi="Times New Roman" w:cs="Times New Roman"/>
+          <w:rFonts w:eastAsia="Times New Roman" w:cs="Times New Roman"/>
           <w:b/>
           <w:bCs/>
           <w:kern w:val="0"/>
@@ -2139,7 +2139,7 @@
       </w:r>
       <w:r>
         <w:rPr>
-          <w:rFonts w:ascii="Times New Roman" w:eastAsia="Times New Roman" w:hAnsi="Times New Roman" w:cs="Times New Roman"/>
+          <w:rFonts w:eastAsia="Times New Roman" w:cs="Times New Roman"/>
           <w:kern w:val="0"/>
           <w:lang w:eastAsia="fr-FR"/>
           <w14:ligatures w14:val="none"/>
@@ -2149,7 +2149,7 @@
       <w:proofErr w:type="gramStart"/>
       <w:r>
         <w:rPr>
-          <w:rFonts w:ascii="Times New Roman" w:eastAsia="Times New Roman" w:hAnsi="Times New Roman" w:cs="Times New Roman"/>
+          <w:rFonts w:eastAsia="Times New Roman" w:cs="Times New Roman"/>
           <w:kern w:val="0"/>
           <w:lang w:eastAsia="fr-FR"/>
           <w14:ligatures w14:val="none"/>
@@ -2159,7 +2159,7 @@
       <w:proofErr w:type="gramEnd"/>
       <w:r>
         <w:rPr>
-          <w:rFonts w:ascii="Times New Roman" w:eastAsia="Times New Roman" w:hAnsi="Times New Roman" w:cs="Times New Roman"/>
+          <w:rFonts w:eastAsia="Times New Roman" w:cs="Times New Roman"/>
           <w:kern w:val="0"/>
           <w:lang w:eastAsia="fr-FR"/>
           <w14:ligatures w14:val="none"/>
@@ -2169,7 +2169,7 @@
       <w:proofErr w:type="gramStart"/>
       <w:r>
         <w:rPr>
-          <w:rFonts w:ascii="Times New Roman" w:eastAsia="Times New Roman" w:hAnsi="Times New Roman" w:cs="Times New Roman"/>
+          <w:rFonts w:eastAsia="Times New Roman" w:cs="Times New Roman"/>
           <w:kern w:val="0"/>
           <w:lang w:eastAsia="fr-FR"/>
           <w14:ligatures w14:val="none"/>
@@ -2179,7 +2179,7 @@
       <w:proofErr w:type="gramEnd"/>
       <w:r>
         <w:rPr>
-          <w:rFonts w:ascii="Times New Roman" w:eastAsia="Times New Roman" w:hAnsi="Times New Roman" w:cs="Times New Roman"/>
+          <w:rFonts w:eastAsia="Times New Roman" w:cs="Times New Roman"/>
           <w:kern w:val="0"/>
           <w:lang w:eastAsia="fr-FR"/>
           <w14:ligatures w14:val="none"/>
@@ -2189,7 +2189,7 @@
       <w:proofErr w:type="gramStart"/>
       <w:r>
         <w:rPr>
-          <w:rFonts w:ascii="Times New Roman" w:eastAsia="Times New Roman" w:hAnsi="Times New Roman" w:cs="Times New Roman"/>
+          <w:rFonts w:eastAsia="Times New Roman" w:cs="Times New Roman"/>
           <w:kern w:val="0"/>
           <w:lang w:eastAsia="fr-FR"/>
           <w14:ligatures w14:val="none"/>
@@ -2199,7 +2199,7 @@
       <w:proofErr w:type="gramEnd"/>
       <w:r>
         <w:rPr>
-          <w:rFonts w:ascii="Times New Roman" w:eastAsia="Times New Roman" w:hAnsi="Times New Roman" w:cs="Times New Roman"/>
+          <w:rFonts w:eastAsia="Times New Roman" w:cs="Times New Roman"/>
           <w:kern w:val="0"/>
           <w:lang w:eastAsia="fr-FR"/>
           <w14:ligatures w14:val="none"/>
@@ -2215,7 +2215,7 @@
         </w:numPr>
         <w:spacing w:before="100" w:beforeAutospacing="1" w:after="100" w:afterAutospacing="1" w:line="240" w:lineRule="auto"/>
         <w:rPr>
-          <w:rFonts w:ascii="Times New Roman" w:eastAsia="Times New Roman" w:hAnsi="Times New Roman" w:cs="Times New Roman"/>
+          <w:rFonts w:eastAsia="Times New Roman" w:cs="Times New Roman"/>
           <w:kern w:val="0"/>
           <w:lang w:eastAsia="fr-FR"/>
           <w14:ligatures w14:val="none"/>
@@ -2224,7 +2224,7 @@
       <w:proofErr w:type="gramStart"/>
       <w:r>
         <w:rPr>
-          <w:rFonts w:ascii="Times New Roman" w:eastAsia="Times New Roman" w:hAnsi="Times New Roman" w:cs="Times New Roman"/>
+          <w:rFonts w:eastAsia="Times New Roman" w:cs="Times New Roman"/>
           <w:b/>
           <w:bCs/>
           <w:kern w:val="0"/>
@@ -2236,7 +2236,7 @@
       <w:proofErr w:type="gramEnd"/>
       <w:r>
         <w:rPr>
-          <w:rFonts w:ascii="Times New Roman" w:eastAsia="Times New Roman" w:hAnsi="Times New Roman" w:cs="Times New Roman"/>
+          <w:rFonts w:eastAsia="Times New Roman" w:cs="Times New Roman"/>
           <w:b/>
           <w:bCs/>
           <w:kern w:val="0"/>
@@ -2247,7 +2247,7 @@
       </w:r>
       <w:r>
         <w:rPr>
-          <w:rFonts w:ascii="Times New Roman" w:eastAsia="Times New Roman" w:hAnsi="Times New Roman" w:cs="Times New Roman"/>
+          <w:rFonts w:eastAsia="Times New Roman" w:cs="Times New Roman"/>
           <w:kern w:val="0"/>
           <w:lang w:eastAsia="fr-FR"/>
           <w14:ligatures w14:val="none"/>
@@ -2257,7 +2257,7 @@
       <w:proofErr w:type="gramStart"/>
       <w:r>
         <w:rPr>
-          <w:rFonts w:ascii="Times New Roman" w:eastAsia="Times New Roman" w:hAnsi="Times New Roman" w:cs="Times New Roman"/>
+          <w:rFonts w:eastAsia="Times New Roman" w:cs="Times New Roman"/>
           <w:kern w:val="0"/>
           <w:lang w:eastAsia="fr-FR"/>
           <w14:ligatures w14:val="none"/>
@@ -2267,7 +2267,7 @@
       <w:proofErr w:type="gramEnd"/>
       <w:r>
         <w:rPr>
-          <w:rFonts w:ascii="Times New Roman" w:eastAsia="Times New Roman" w:hAnsi="Times New Roman" w:cs="Times New Roman"/>
+          <w:rFonts w:eastAsia="Times New Roman" w:cs="Times New Roman"/>
           <w:kern w:val="0"/>
           <w:lang w:eastAsia="fr-FR"/>
           <w14:ligatures w14:val="none"/>
@@ -2277,7 +2277,7 @@
       <w:proofErr w:type="gramStart"/>
       <w:r>
         <w:rPr>
-          <w:rFonts w:ascii="Times New Roman" w:eastAsia="Times New Roman" w:hAnsi="Times New Roman" w:cs="Times New Roman"/>
+          <w:rFonts w:eastAsia="Times New Roman" w:cs="Times New Roman"/>
           <w:kern w:val="0"/>
           <w:lang w:eastAsia="fr-FR"/>
           <w14:ligatures w14:val="none"/>
@@ -2287,7 +2287,7 @@
       <w:proofErr w:type="gramEnd"/>
       <w:r>
         <w:rPr>
-          <w:rFonts w:ascii="Times New Roman" w:eastAsia="Times New Roman" w:hAnsi="Times New Roman" w:cs="Times New Roman"/>
+          <w:rFonts w:eastAsia="Times New Roman" w:cs="Times New Roman"/>
           <w:kern w:val="0"/>
           <w:lang w:eastAsia="fr-FR"/>
           <w14:ligatures w14:val="none"/>
@@ -2303,7 +2303,7 @@
         </w:numPr>
         <w:spacing w:before="100" w:beforeAutospacing="1" w:after="100" w:afterAutospacing="1" w:line="240" w:lineRule="auto"/>
         <w:rPr>
-          <w:rFonts w:ascii="Times New Roman" w:eastAsia="Times New Roman" w:hAnsi="Times New Roman" w:cs="Times New Roman"/>
+          <w:rFonts w:eastAsia="Times New Roman" w:cs="Times New Roman"/>
           <w:kern w:val="0"/>
           <w:lang w:eastAsia="fr-FR"/>
           <w14:ligatures w14:val="none"/>
@@ -2312,7 +2312,7 @@
       <w:proofErr w:type="gramStart"/>
       <w:r>
         <w:rPr>
-          <w:rFonts w:ascii="Times New Roman" w:eastAsia="Times New Roman" w:hAnsi="Times New Roman" w:cs="Times New Roman"/>
+          <w:rFonts w:eastAsia="Times New Roman" w:cs="Times New Roman"/>
           <w:b/>
           <w:bCs/>
           <w:kern w:val="0"/>
@@ -2324,7 +2324,7 @@
       <w:proofErr w:type="gramEnd"/>
       <w:r>
         <w:rPr>
-          <w:rFonts w:ascii="Times New Roman" w:eastAsia="Times New Roman" w:hAnsi="Times New Roman" w:cs="Times New Roman"/>
+          <w:rFonts w:eastAsia="Times New Roman" w:cs="Times New Roman"/>
           <w:b/>
           <w:bCs/>
           <w:kern w:val="0"/>
@@ -2335,7 +2335,7 @@
       </w:r>
       <w:r>
         <w:rPr>
-          <w:rFonts w:ascii="Times New Roman" w:eastAsia="Times New Roman" w:hAnsi="Times New Roman" w:cs="Times New Roman"/>
+          <w:rFonts w:eastAsia="Times New Roman" w:cs="Times New Roman"/>
           <w:kern w:val="0"/>
           <w:lang w:eastAsia="fr-FR"/>
           <w14:ligatures w14:val="none"/>
@@ -2351,15 +2351,15 @@
         </w:numPr>
         <w:spacing w:before="100" w:beforeAutospacing="1" w:after="100" w:afterAutospacing="1" w:line="240" w:lineRule="auto"/>
         <w:rPr>
-          <w:rFonts w:ascii="Times New Roman" w:eastAsia="Times New Roman" w:hAnsi="Times New Roman" w:cs="Times New Roman"/>
-          <w:kern w:val="0"/>
-          <w:lang w:eastAsia="fr-FR"/>
-          <w14:ligatures w14:val="none"/>
-        </w:rPr>
-      </w:pPr>
-      <w:r>
-        <w:rPr>
-          <w:rFonts w:ascii="Times New Roman" w:eastAsia="Times New Roman" w:hAnsi="Times New Roman" w:cs="Times New Roman"/>
+          <w:rFonts w:eastAsia="Times New Roman" w:cs="Times New Roman"/>
+          <w:kern w:val="0"/>
+          <w:lang w:eastAsia="fr-FR"/>
+          <w14:ligatures w14:val="none"/>
+        </w:rPr>
+      </w:pPr>
+      <w:r>
+        <w:rPr>
+          <w:rFonts w:eastAsia="Times New Roman" w:cs="Times New Roman"/>
           <w:b/>
           <w:bCs/>
           <w:kern w:val="0"/>
@@ -2370,7 +2370,7 @@
       </w:r>
       <w:r>
         <w:rPr>
-          <w:rFonts w:ascii="Times New Roman" w:eastAsia="Times New Roman" w:hAnsi="Times New Roman" w:cs="Times New Roman"/>
+          <w:rFonts w:eastAsia="Times New Roman" w:cs="Times New Roman"/>
           <w:kern w:val="0"/>
           <w:lang w:eastAsia="fr-FR"/>
           <w14:ligatures w14:val="none"/>
@@ -2380,7 +2380,7 @@
       <w:proofErr w:type="spellStart"/>
       <w:r>
         <w:rPr>
-          <w:rFonts w:ascii="Times New Roman" w:eastAsia="Times New Roman" w:hAnsi="Times New Roman" w:cs="Times New Roman"/>
+          <w:rFonts w:eastAsia="Times New Roman" w:cs="Times New Roman"/>
           <w:kern w:val="0"/>
           <w:lang w:eastAsia="fr-FR"/>
           <w14:ligatures w14:val="none"/>
@@ -2390,7 +2390,7 @@
       <w:proofErr w:type="spellEnd"/>
       <w:r>
         <w:rPr>
-          <w:rFonts w:ascii="Times New Roman" w:eastAsia="Times New Roman" w:hAnsi="Times New Roman" w:cs="Times New Roman"/>
+          <w:rFonts w:eastAsia="Times New Roman" w:cs="Times New Roman"/>
           <w:kern w:val="0"/>
           <w:lang w:eastAsia="fr-FR"/>
           <w14:ligatures w14:val="none"/>
@@ -2402,15 +2402,15 @@
       <w:pPr>
         <w:spacing w:before="100" w:beforeAutospacing="1" w:after="100" w:afterAutospacing="1" w:line="240" w:lineRule="auto"/>
         <w:rPr>
-          <w:rFonts w:ascii="Times New Roman" w:eastAsia="Times New Roman" w:hAnsi="Times New Roman" w:cs="Times New Roman"/>
-          <w:kern w:val="0"/>
-          <w:lang w:eastAsia="fr-FR"/>
-          <w14:ligatures w14:val="none"/>
-        </w:rPr>
-      </w:pPr>
-      <w:r>
-        <w:rPr>
-          <w:rFonts w:ascii="Times New Roman" w:eastAsia="Times New Roman" w:hAnsi="Times New Roman" w:cs="Times New Roman"/>
+          <w:rFonts w:eastAsia="Times New Roman" w:cs="Times New Roman"/>
+          <w:kern w:val="0"/>
+          <w:lang w:eastAsia="fr-FR"/>
+          <w14:ligatures w14:val="none"/>
+        </w:rPr>
+      </w:pPr>
+      <w:r>
+        <w:rPr>
+          <w:rFonts w:eastAsia="Times New Roman" w:cs="Times New Roman"/>
           <w:b/>
           <w:bCs/>
           <w:kern w:val="0"/>
@@ -2428,26 +2428,27 @@
         </w:numPr>
         <w:spacing w:before="100" w:beforeAutospacing="1" w:after="100" w:afterAutospacing="1" w:line="240" w:lineRule="auto"/>
         <w:rPr>
-          <w:rFonts w:ascii="Times New Roman" w:eastAsia="Times New Roman" w:hAnsi="Times New Roman" w:cs="Times New Roman"/>
-          <w:kern w:val="0"/>
-          <w:lang w:eastAsia="fr-FR"/>
-          <w14:ligatures w14:val="none"/>
-        </w:rPr>
-      </w:pPr>
-      <w:r>
-        <w:rPr>
-          <w:rFonts w:ascii="Times New Roman" w:eastAsia="Times New Roman" w:hAnsi="Times New Roman" w:cs="Times New Roman"/>
-          <w:b/>
-          <w:bCs/>
-          <w:kern w:val="0"/>
-          <w:lang w:eastAsia="fr-FR"/>
-          <w14:ligatures w14:val="none"/>
-        </w:rPr>
+          <w:rFonts w:eastAsia="Times New Roman" w:cs="Times New Roman"/>
+          <w:kern w:val="0"/>
+          <w:lang w:eastAsia="fr-FR"/>
+          <w14:ligatures w14:val="none"/>
+        </w:rPr>
+      </w:pPr>
+      <w:r>
+        <w:rPr>
+          <w:rFonts w:eastAsia="Times New Roman" w:cs="Times New Roman"/>
+          <w:b/>
+          <w:bCs/>
+          <w:kern w:val="0"/>
+          <w:lang w:eastAsia="fr-FR"/>
+          <w14:ligatures w14:val="none"/>
+        </w:rPr>
+        <w:lastRenderedPageBreak/>
         <w:t>Boutons :</w:t>
       </w:r>
       <w:r>
         <w:rPr>
-          <w:rFonts w:ascii="Times New Roman" w:eastAsia="Times New Roman" w:hAnsi="Times New Roman" w:cs="Times New Roman"/>
+          <w:rFonts w:eastAsia="Times New Roman" w:cs="Times New Roman"/>
           <w:kern w:val="0"/>
           <w:lang w:eastAsia="fr-FR"/>
           <w14:ligatures w14:val="none"/>
@@ -2457,7 +2458,7 @@
       <w:proofErr w:type="spellStart"/>
       <w:r>
         <w:rPr>
-          <w:rFonts w:ascii="Courier New" w:eastAsia="Times New Roman" w:hAnsi="Courier New" w:cs="Courier New"/>
+          <w:rFonts w:eastAsia="Times New Roman" w:cs="Courier New"/>
           <w:kern w:val="0"/>
           <w:sz w:val="20"/>
           <w:szCs w:val="20"/>
@@ -2469,7 +2470,7 @@
       <w:proofErr w:type="spellEnd"/>
       <w:r>
         <w:rPr>
-          <w:rFonts w:ascii="Courier New" w:eastAsia="Times New Roman" w:hAnsi="Courier New" w:cs="Courier New"/>
+          <w:rFonts w:eastAsia="Times New Roman" w:cs="Courier New"/>
           <w:kern w:val="0"/>
           <w:sz w:val="20"/>
           <w:szCs w:val="20"/>
@@ -2480,7 +2481,7 @@
       </w:r>
       <w:r>
         <w:rPr>
-          <w:rFonts w:ascii="Times New Roman" w:eastAsia="Times New Roman" w:hAnsi="Times New Roman" w:cs="Times New Roman"/>
+          <w:rFonts w:eastAsia="Times New Roman" w:cs="Times New Roman"/>
           <w:kern w:val="0"/>
           <w:lang w:eastAsia="fr-FR"/>
           <w14:ligatures w14:val="none"/>
@@ -2490,7 +2491,7 @@
       <w:proofErr w:type="spellStart"/>
       <w:r>
         <w:rPr>
-          <w:rFonts w:ascii="Courier New" w:eastAsia="Times New Roman" w:hAnsi="Courier New" w:cs="Courier New"/>
+          <w:rFonts w:eastAsia="Times New Roman" w:cs="Courier New"/>
           <w:kern w:val="0"/>
           <w:sz w:val="20"/>
           <w:szCs w:val="20"/>
@@ -2502,7 +2503,7 @@
       <w:proofErr w:type="spellEnd"/>
       <w:r>
         <w:rPr>
-          <w:rFonts w:ascii="Courier New" w:eastAsia="Times New Roman" w:hAnsi="Courier New" w:cs="Courier New"/>
+          <w:rFonts w:eastAsia="Times New Roman" w:cs="Courier New"/>
           <w:kern w:val="0"/>
           <w:sz w:val="20"/>
           <w:szCs w:val="20"/>
@@ -2513,7 +2514,7 @@
       </w:r>
       <w:r>
         <w:rPr>
-          <w:rFonts w:ascii="Times New Roman" w:eastAsia="Times New Roman" w:hAnsi="Times New Roman" w:cs="Times New Roman"/>
+          <w:rFonts w:eastAsia="Times New Roman" w:cs="Times New Roman"/>
           <w:kern w:val="0"/>
           <w:lang w:eastAsia="fr-FR"/>
           <w14:ligatures w14:val="none"/>
@@ -2523,7 +2524,7 @@
       <w:proofErr w:type="spellStart"/>
       <w:r>
         <w:rPr>
-          <w:rFonts w:ascii="Times New Roman" w:eastAsia="Times New Roman" w:hAnsi="Times New Roman" w:cs="Times New Roman"/>
+          <w:rFonts w:eastAsia="Times New Roman" w:cs="Times New Roman"/>
           <w:kern w:val="0"/>
           <w:lang w:eastAsia="fr-FR"/>
           <w14:ligatures w14:val="none"/>
@@ -2533,7 +2534,7 @@
       <w:proofErr w:type="spellEnd"/>
       <w:r>
         <w:rPr>
-          <w:rFonts w:ascii="Times New Roman" w:eastAsia="Times New Roman" w:hAnsi="Times New Roman" w:cs="Times New Roman"/>
+          <w:rFonts w:eastAsia="Times New Roman" w:cs="Times New Roman"/>
           <w:kern w:val="0"/>
           <w:lang w:eastAsia="fr-FR"/>
           <w14:ligatures w14:val="none"/>
@@ -2549,28 +2550,27 @@
         </w:numPr>
         <w:spacing w:before="100" w:beforeAutospacing="1" w:after="100" w:afterAutospacing="1" w:line="240" w:lineRule="auto"/>
         <w:rPr>
-          <w:rFonts w:ascii="Times New Roman" w:eastAsia="Times New Roman" w:hAnsi="Times New Roman" w:cs="Times New Roman"/>
-          <w:kern w:val="0"/>
-          <w:lang w:eastAsia="fr-FR"/>
-          <w14:ligatures w14:val="none"/>
-        </w:rPr>
-      </w:pPr>
-      <w:r>
-        <w:rPr>
-          <w:rFonts w:ascii="Times New Roman" w:eastAsia="Times New Roman" w:hAnsi="Times New Roman" w:cs="Times New Roman"/>
-          <w:b/>
-          <w:bCs/>
-          <w:kern w:val="0"/>
-          <w:lang w:eastAsia="fr-FR"/>
-          <w14:ligatures w14:val="none"/>
-        </w:rPr>
-        <w:lastRenderedPageBreak/>
+          <w:rFonts w:eastAsia="Times New Roman" w:cs="Times New Roman"/>
+          <w:kern w:val="0"/>
+          <w:lang w:eastAsia="fr-FR"/>
+          <w14:ligatures w14:val="none"/>
+        </w:rPr>
+      </w:pPr>
+      <w:r>
+        <w:rPr>
+          <w:rFonts w:eastAsia="Times New Roman" w:cs="Times New Roman"/>
+          <w:b/>
+          <w:bCs/>
+          <w:kern w:val="0"/>
+          <w:lang w:eastAsia="fr-FR"/>
+          <w14:ligatures w14:val="none"/>
+        </w:rPr>
         <w:t>Cartes (</w:t>
       </w:r>
       <w:proofErr w:type="spellStart"/>
       <w:r>
         <w:rPr>
-          <w:rFonts w:ascii="Times New Roman" w:eastAsia="Times New Roman" w:hAnsi="Times New Roman" w:cs="Times New Roman"/>
+          <w:rFonts w:eastAsia="Times New Roman" w:cs="Times New Roman"/>
           <w:b/>
           <w:bCs/>
           <w:kern w:val="0"/>
@@ -2582,7 +2582,7 @@
       <w:proofErr w:type="spellEnd"/>
       <w:r>
         <w:rPr>
-          <w:rFonts w:ascii="Times New Roman" w:eastAsia="Times New Roman" w:hAnsi="Times New Roman" w:cs="Times New Roman"/>
+          <w:rFonts w:eastAsia="Times New Roman" w:cs="Times New Roman"/>
           <w:b/>
           <w:bCs/>
           <w:kern w:val="0"/>
@@ -2593,7 +2593,7 @@
       </w:r>
       <w:r>
         <w:rPr>
-          <w:rFonts w:ascii="Times New Roman" w:eastAsia="Times New Roman" w:hAnsi="Times New Roman" w:cs="Times New Roman"/>
+          <w:rFonts w:eastAsia="Times New Roman" w:cs="Times New Roman"/>
           <w:kern w:val="0"/>
           <w:lang w:eastAsia="fr-FR"/>
           <w14:ligatures w14:val="none"/>
@@ -2602,7 +2602,7 @@
       </w:r>
       <w:r>
         <w:rPr>
-          <w:rFonts w:ascii="Courier New" w:eastAsia="Times New Roman" w:hAnsi="Courier New" w:cs="Courier New"/>
+          <w:rFonts w:eastAsia="Times New Roman" w:cs="Courier New"/>
           <w:kern w:val="0"/>
           <w:sz w:val="20"/>
           <w:szCs w:val="20"/>
@@ -2613,7 +2613,7 @@
       </w:r>
       <w:r>
         <w:rPr>
-          <w:rFonts w:ascii="Times New Roman" w:eastAsia="Times New Roman" w:hAnsi="Times New Roman" w:cs="Times New Roman"/>
+          <w:rFonts w:eastAsia="Times New Roman" w:cs="Times New Roman"/>
           <w:kern w:val="0"/>
           <w:lang w:eastAsia="fr-FR"/>
           <w14:ligatures w14:val="none"/>
@@ -2622,7 +2622,7 @@
       </w:r>
       <w:r>
         <w:rPr>
-          <w:rFonts w:ascii="Courier New" w:eastAsia="Times New Roman" w:hAnsi="Courier New" w:cs="Courier New"/>
+          <w:rFonts w:eastAsia="Times New Roman" w:cs="Courier New"/>
           <w:kern w:val="0"/>
           <w:sz w:val="20"/>
           <w:szCs w:val="20"/>
@@ -2633,7 +2633,7 @@
       </w:r>
       <w:r>
         <w:rPr>
-          <w:rFonts w:ascii="Times New Roman" w:eastAsia="Times New Roman" w:hAnsi="Times New Roman" w:cs="Times New Roman"/>
+          <w:rFonts w:eastAsia="Times New Roman" w:cs="Times New Roman"/>
           <w:kern w:val="0"/>
           <w:lang w:eastAsia="fr-FR"/>
           <w14:ligatures w14:val="none"/>
@@ -2642,7 +2642,7 @@
       </w:r>
       <w:r>
         <w:rPr>
-          <w:rFonts w:ascii="Courier New" w:eastAsia="Times New Roman" w:hAnsi="Courier New" w:cs="Courier New"/>
+          <w:rFonts w:eastAsia="Times New Roman" w:cs="Courier New"/>
           <w:kern w:val="0"/>
           <w:sz w:val="20"/>
           <w:szCs w:val="20"/>
@@ -2653,7 +2653,7 @@
       </w:r>
       <w:r>
         <w:rPr>
-          <w:rFonts w:ascii="Times New Roman" w:eastAsia="Times New Roman" w:hAnsi="Times New Roman" w:cs="Times New Roman"/>
+          <w:rFonts w:eastAsia="Times New Roman" w:cs="Times New Roman"/>
           <w:kern w:val="0"/>
           <w:lang w:eastAsia="fr-FR"/>
           <w14:ligatures w14:val="none"/>
@@ -2669,15 +2669,15 @@
         </w:numPr>
         <w:spacing w:before="100" w:beforeAutospacing="1" w:after="100" w:afterAutospacing="1" w:line="240" w:lineRule="auto"/>
         <w:rPr>
-          <w:rFonts w:ascii="Times New Roman" w:eastAsia="Times New Roman" w:hAnsi="Times New Roman" w:cs="Times New Roman"/>
-          <w:kern w:val="0"/>
-          <w:lang w:eastAsia="fr-FR"/>
-          <w14:ligatures w14:val="none"/>
-        </w:rPr>
-      </w:pPr>
-      <w:r>
-        <w:rPr>
-          <w:rFonts w:ascii="Times New Roman" w:eastAsia="Times New Roman" w:hAnsi="Times New Roman" w:cs="Times New Roman"/>
+          <w:rFonts w:eastAsia="Times New Roman" w:cs="Times New Roman"/>
+          <w:kern w:val="0"/>
+          <w:lang w:eastAsia="fr-FR"/>
+          <w14:ligatures w14:val="none"/>
+        </w:rPr>
+      </w:pPr>
+      <w:r>
+        <w:rPr>
+          <w:rFonts w:eastAsia="Times New Roman" w:cs="Times New Roman"/>
           <w:b/>
           <w:bCs/>
           <w:kern w:val="0"/>
@@ -2688,7 +2688,7 @@
       </w:r>
       <w:r>
         <w:rPr>
-          <w:rFonts w:ascii="Times New Roman" w:eastAsia="Times New Roman" w:hAnsi="Times New Roman" w:cs="Times New Roman"/>
+          <w:rFonts w:eastAsia="Times New Roman" w:cs="Times New Roman"/>
           <w:kern w:val="0"/>
           <w:lang w:eastAsia="fr-FR"/>
           <w14:ligatures w14:val="none"/>
@@ -2698,7 +2698,7 @@
       <w:proofErr w:type="spellStart"/>
       <w:r>
         <w:rPr>
-          <w:rFonts w:ascii="Courier New" w:eastAsia="Times New Roman" w:hAnsi="Courier New" w:cs="Courier New"/>
+          <w:rFonts w:eastAsia="Times New Roman" w:cs="Courier New"/>
           <w:kern w:val="0"/>
           <w:sz w:val="20"/>
           <w:szCs w:val="20"/>
@@ -2710,7 +2710,7 @@
       <w:proofErr w:type="spellEnd"/>
       <w:r>
         <w:rPr>
-          <w:rFonts w:ascii="Courier New" w:eastAsia="Times New Roman" w:hAnsi="Courier New" w:cs="Courier New"/>
+          <w:rFonts w:eastAsia="Times New Roman" w:cs="Courier New"/>
           <w:kern w:val="0"/>
           <w:sz w:val="20"/>
           <w:szCs w:val="20"/>
@@ -2721,7 +2721,7 @@
       </w:r>
       <w:r>
         <w:rPr>
-          <w:rFonts w:ascii="Times New Roman" w:eastAsia="Times New Roman" w:hAnsi="Times New Roman" w:cs="Times New Roman"/>
+          <w:rFonts w:eastAsia="Times New Roman" w:cs="Times New Roman"/>
           <w:kern w:val="0"/>
           <w:lang w:eastAsia="fr-FR"/>
           <w14:ligatures w14:val="none"/>
@@ -2731,7 +2731,7 @@
       <w:proofErr w:type="spellStart"/>
       <w:r>
         <w:rPr>
-          <w:rFonts w:ascii="Courier New" w:eastAsia="Times New Roman" w:hAnsi="Courier New" w:cs="Courier New"/>
+          <w:rFonts w:eastAsia="Times New Roman" w:cs="Courier New"/>
           <w:kern w:val="0"/>
           <w:sz w:val="20"/>
           <w:szCs w:val="20"/>
@@ -2743,7 +2743,7 @@
       <w:proofErr w:type="spellEnd"/>
       <w:r>
         <w:rPr>
-          <w:rFonts w:ascii="Courier New" w:eastAsia="Times New Roman" w:hAnsi="Courier New" w:cs="Courier New"/>
+          <w:rFonts w:eastAsia="Times New Roman" w:cs="Courier New"/>
           <w:kern w:val="0"/>
           <w:sz w:val="20"/>
           <w:szCs w:val="20"/>
@@ -2754,7 +2754,7 @@
       </w:r>
       <w:r>
         <w:rPr>
-          <w:rFonts w:ascii="Times New Roman" w:eastAsia="Times New Roman" w:hAnsi="Times New Roman" w:cs="Times New Roman"/>
+          <w:rFonts w:eastAsia="Times New Roman" w:cs="Times New Roman"/>
           <w:kern w:val="0"/>
           <w:lang w:eastAsia="fr-FR"/>
           <w14:ligatures w14:val="none"/>
@@ -2763,7 +2763,7 @@
       </w:r>
       <w:r>
         <w:rPr>
-          <w:rFonts w:ascii="Courier New" w:eastAsia="Times New Roman" w:hAnsi="Courier New" w:cs="Courier New"/>
+          <w:rFonts w:eastAsia="Times New Roman" w:cs="Courier New"/>
           <w:kern w:val="0"/>
           <w:sz w:val="20"/>
           <w:szCs w:val="20"/>
@@ -2774,7 +2774,7 @@
       </w:r>
       <w:r>
         <w:rPr>
-          <w:rFonts w:ascii="Times New Roman" w:eastAsia="Times New Roman" w:hAnsi="Times New Roman" w:cs="Times New Roman"/>
+          <w:rFonts w:eastAsia="Times New Roman" w:cs="Times New Roman"/>
           <w:kern w:val="0"/>
           <w:lang w:eastAsia="fr-FR"/>
           <w14:ligatures w14:val="none"/>
@@ -2784,7 +2784,7 @@
       <w:proofErr w:type="spellStart"/>
       <w:r>
         <w:rPr>
-          <w:rFonts w:ascii="Times New Roman" w:eastAsia="Times New Roman" w:hAnsi="Times New Roman" w:cs="Times New Roman"/>
+          <w:rFonts w:eastAsia="Times New Roman" w:cs="Times New Roman"/>
           <w:kern w:val="0"/>
           <w:lang w:eastAsia="fr-FR"/>
           <w14:ligatures w14:val="none"/>
@@ -2794,7 +2794,7 @@
       <w:proofErr w:type="spellEnd"/>
       <w:r>
         <w:rPr>
-          <w:rFonts w:ascii="Times New Roman" w:eastAsia="Times New Roman" w:hAnsi="Times New Roman" w:cs="Times New Roman"/>
+          <w:rFonts w:eastAsia="Times New Roman" w:cs="Times New Roman"/>
           <w:kern w:val="0"/>
           <w:lang w:eastAsia="fr-FR"/>
           <w14:ligatures w14:val="none"/>
@@ -2810,15 +2810,15 @@
         </w:numPr>
         <w:spacing w:before="100" w:beforeAutospacing="1" w:after="100" w:afterAutospacing="1" w:line="240" w:lineRule="auto"/>
         <w:rPr>
-          <w:rFonts w:ascii="Times New Roman" w:eastAsia="Times New Roman" w:hAnsi="Times New Roman" w:cs="Times New Roman"/>
-          <w:kern w:val="0"/>
-          <w:lang w:eastAsia="fr-FR"/>
-          <w14:ligatures w14:val="none"/>
-        </w:rPr>
-      </w:pPr>
-      <w:r>
-        <w:rPr>
-          <w:rFonts w:ascii="Times New Roman" w:eastAsia="Times New Roman" w:hAnsi="Times New Roman" w:cs="Times New Roman"/>
+          <w:rFonts w:eastAsia="Times New Roman" w:cs="Times New Roman"/>
+          <w:kern w:val="0"/>
+          <w:lang w:eastAsia="fr-FR"/>
+          <w14:ligatures w14:val="none"/>
+        </w:rPr>
+      </w:pPr>
+      <w:r>
+        <w:rPr>
+          <w:rFonts w:eastAsia="Times New Roman" w:cs="Times New Roman"/>
           <w:b/>
           <w:bCs/>
           <w:kern w:val="0"/>
@@ -2829,7 +2829,7 @@
       </w:r>
       <w:r>
         <w:rPr>
-          <w:rFonts w:ascii="Times New Roman" w:eastAsia="Times New Roman" w:hAnsi="Times New Roman" w:cs="Times New Roman"/>
+          <w:rFonts w:eastAsia="Times New Roman" w:cs="Times New Roman"/>
           <w:kern w:val="0"/>
           <w:lang w:eastAsia="fr-FR"/>
           <w14:ligatures w14:val="none"/>
@@ -2839,7 +2839,7 @@
       <w:proofErr w:type="spellStart"/>
       <w:r>
         <w:rPr>
-          <w:rFonts w:ascii="Courier New" w:eastAsia="Times New Roman" w:hAnsi="Courier New" w:cs="Courier New"/>
+          <w:rFonts w:eastAsia="Times New Roman" w:cs="Courier New"/>
           <w:kern w:val="0"/>
           <w:sz w:val="20"/>
           <w:szCs w:val="20"/>
@@ -2851,7 +2851,7 @@
       <w:proofErr w:type="spellEnd"/>
       <w:r>
         <w:rPr>
-          <w:rFonts w:ascii="Courier New" w:eastAsia="Times New Roman" w:hAnsi="Courier New" w:cs="Courier New"/>
+          <w:rFonts w:eastAsia="Times New Roman" w:cs="Courier New"/>
           <w:kern w:val="0"/>
           <w:sz w:val="20"/>
           <w:szCs w:val="20"/>
@@ -2862,7 +2862,7 @@
       </w:r>
       <w:r>
         <w:rPr>
-          <w:rFonts w:ascii="Times New Roman" w:eastAsia="Times New Roman" w:hAnsi="Times New Roman" w:cs="Times New Roman"/>
+          <w:rFonts w:eastAsia="Times New Roman" w:cs="Times New Roman"/>
           <w:kern w:val="0"/>
           <w:lang w:eastAsia="fr-FR"/>
           <w14:ligatures w14:val="none"/>
@@ -2871,7 +2871,7 @@
       </w:r>
       <w:r>
         <w:rPr>
-          <w:rFonts w:ascii="Courier New" w:eastAsia="Times New Roman" w:hAnsi="Courier New" w:cs="Courier New"/>
+          <w:rFonts w:eastAsia="Times New Roman" w:cs="Courier New"/>
           <w:kern w:val="0"/>
           <w:sz w:val="20"/>
           <w:szCs w:val="20"/>
@@ -2882,7 +2882,7 @@
       </w:r>
       <w:r>
         <w:rPr>
-          <w:rFonts w:ascii="Times New Roman" w:eastAsia="Times New Roman" w:hAnsi="Times New Roman" w:cs="Times New Roman"/>
+          <w:rFonts w:eastAsia="Times New Roman" w:cs="Times New Roman"/>
           <w:kern w:val="0"/>
           <w:lang w:eastAsia="fr-FR"/>
           <w14:ligatures w14:val="none"/>
@@ -2892,7 +2892,7 @@
       <w:proofErr w:type="spellStart"/>
       <w:r>
         <w:rPr>
-          <w:rFonts w:ascii="Courier New" w:eastAsia="Times New Roman" w:hAnsi="Courier New" w:cs="Courier New"/>
+          <w:rFonts w:eastAsia="Times New Roman" w:cs="Courier New"/>
           <w:kern w:val="0"/>
           <w:sz w:val="20"/>
           <w:szCs w:val="20"/>
@@ -2904,7 +2904,7 @@
       <w:proofErr w:type="spellEnd"/>
       <w:r>
         <w:rPr>
-          <w:rFonts w:ascii="Courier New" w:eastAsia="Times New Roman" w:hAnsi="Courier New" w:cs="Courier New"/>
+          <w:rFonts w:eastAsia="Times New Roman" w:cs="Courier New"/>
           <w:kern w:val="0"/>
           <w:sz w:val="20"/>
           <w:szCs w:val="20"/>
@@ -2915,7 +2915,7 @@
       </w:r>
       <w:r>
         <w:rPr>
-          <w:rFonts w:ascii="Times New Roman" w:eastAsia="Times New Roman" w:hAnsi="Times New Roman" w:cs="Times New Roman"/>
+          <w:rFonts w:eastAsia="Times New Roman" w:cs="Times New Roman"/>
           <w:kern w:val="0"/>
           <w:lang w:eastAsia="fr-FR"/>
           <w14:ligatures w14:val="none"/>
@@ -2931,15 +2931,15 @@
         </w:numPr>
         <w:spacing w:before="100" w:beforeAutospacing="1" w:after="100" w:afterAutospacing="1" w:line="240" w:lineRule="auto"/>
         <w:rPr>
-          <w:rFonts w:ascii="Times New Roman" w:eastAsia="Times New Roman" w:hAnsi="Times New Roman" w:cs="Times New Roman"/>
-          <w:kern w:val="0"/>
-          <w:lang w:eastAsia="fr-FR"/>
-          <w14:ligatures w14:val="none"/>
-        </w:rPr>
-      </w:pPr>
-      <w:r>
-        <w:rPr>
-          <w:rFonts w:ascii="Times New Roman" w:eastAsia="Times New Roman" w:hAnsi="Times New Roman" w:cs="Times New Roman"/>
+          <w:rFonts w:eastAsia="Times New Roman" w:cs="Times New Roman"/>
+          <w:kern w:val="0"/>
+          <w:lang w:eastAsia="fr-FR"/>
+          <w14:ligatures w14:val="none"/>
+        </w:rPr>
+      </w:pPr>
+      <w:r>
+        <w:rPr>
+          <w:rFonts w:eastAsia="Times New Roman" w:cs="Times New Roman"/>
           <w:b/>
           <w:bCs/>
           <w:kern w:val="0"/>
@@ -2950,7 +2950,7 @@
       </w:r>
       <w:r>
         <w:rPr>
-          <w:rFonts w:ascii="Times New Roman" w:eastAsia="Times New Roman" w:hAnsi="Times New Roman" w:cs="Times New Roman"/>
+          <w:rFonts w:eastAsia="Times New Roman" w:cs="Times New Roman"/>
           <w:kern w:val="0"/>
           <w:lang w:eastAsia="fr-FR"/>
           <w14:ligatures w14:val="none"/>
@@ -2960,7 +2960,7 @@
       <w:proofErr w:type="spellStart"/>
       <w:r>
         <w:rPr>
-          <w:rFonts w:ascii="Times New Roman" w:eastAsia="Times New Roman" w:hAnsi="Times New Roman" w:cs="Times New Roman"/>
+          <w:rFonts w:eastAsia="Times New Roman" w:cs="Times New Roman"/>
           <w:kern w:val="0"/>
           <w:lang w:eastAsia="fr-FR"/>
           <w14:ligatures w14:val="none"/>
@@ -2970,7 +2970,7 @@
       <w:proofErr w:type="spellEnd"/>
       <w:r>
         <w:rPr>
-          <w:rFonts w:ascii="Times New Roman" w:eastAsia="Times New Roman" w:hAnsi="Times New Roman" w:cs="Times New Roman"/>
+          <w:rFonts w:eastAsia="Times New Roman" w:cs="Times New Roman"/>
           <w:kern w:val="0"/>
           <w:lang w:eastAsia="fr-FR"/>
           <w14:ligatures w14:val="none"/>
@@ -2979,7 +2979,7 @@
       </w:r>
       <w:r>
         <w:rPr>
-          <w:rFonts w:ascii="Courier New" w:eastAsia="Times New Roman" w:hAnsi="Courier New" w:cs="Courier New"/>
+          <w:rFonts w:eastAsia="Times New Roman" w:cs="Courier New"/>
           <w:kern w:val="0"/>
           <w:sz w:val="20"/>
           <w:szCs w:val="20"/>
@@ -2990,7 +2990,7 @@
       </w:r>
       <w:r>
         <w:rPr>
-          <w:rFonts w:ascii="Times New Roman" w:eastAsia="Times New Roman" w:hAnsi="Times New Roman" w:cs="Times New Roman"/>
+          <w:rFonts w:eastAsia="Times New Roman" w:cs="Times New Roman"/>
           <w:kern w:val="0"/>
           <w:lang w:eastAsia="fr-FR"/>
           <w14:ligatures w14:val="none"/>
@@ -2999,7 +2999,7 @@
       </w:r>
       <w:r>
         <w:rPr>
-          <w:rFonts w:ascii="Courier New" w:eastAsia="Times New Roman" w:hAnsi="Courier New" w:cs="Courier New"/>
+          <w:rFonts w:eastAsia="Times New Roman" w:cs="Courier New"/>
           <w:kern w:val="0"/>
           <w:sz w:val="20"/>
           <w:szCs w:val="20"/>
@@ -3010,7 +3010,7 @@
       </w:r>
       <w:r>
         <w:rPr>
-          <w:rFonts w:ascii="Times New Roman" w:eastAsia="Times New Roman" w:hAnsi="Times New Roman" w:cs="Times New Roman"/>
+          <w:rFonts w:eastAsia="Times New Roman" w:cs="Times New Roman"/>
           <w:kern w:val="0"/>
           <w:lang w:eastAsia="fr-FR"/>
           <w14:ligatures w14:val="none"/>
@@ -3022,15 +3022,15 @@
       <w:pPr>
         <w:spacing w:before="100" w:beforeAutospacing="1" w:after="100" w:afterAutospacing="1" w:line="240" w:lineRule="auto"/>
         <w:rPr>
-          <w:rFonts w:ascii="Times New Roman" w:eastAsia="Times New Roman" w:hAnsi="Times New Roman" w:cs="Times New Roman"/>
-          <w:kern w:val="0"/>
-          <w:lang w:eastAsia="fr-FR"/>
-          <w14:ligatures w14:val="none"/>
-        </w:rPr>
-      </w:pPr>
-      <w:r>
-        <w:rPr>
-          <w:rFonts w:ascii="Times New Roman" w:eastAsia="Times New Roman" w:hAnsi="Times New Roman" w:cs="Times New Roman"/>
+          <w:rFonts w:eastAsia="Times New Roman" w:cs="Times New Roman"/>
+          <w:kern w:val="0"/>
+          <w:lang w:eastAsia="fr-FR"/>
+          <w14:ligatures w14:val="none"/>
+        </w:rPr>
+      </w:pPr>
+      <w:r>
+        <w:rPr>
+          <w:rFonts w:eastAsia="Times New Roman" w:cs="Times New Roman"/>
           <w:b/>
           <w:bCs/>
           <w:kern w:val="0"/>
@@ -3041,12 +3041,59 @@
       </w:r>
       <w:r>
         <w:rPr>
-          <w:rFonts w:ascii="Times New Roman" w:eastAsia="Times New Roman" w:hAnsi="Times New Roman" w:cs="Times New Roman"/>
-          <w:kern w:val="0"/>
-          <w:lang w:eastAsia="fr-FR"/>
-          <w14:ligatures w14:val="none"/>
-        </w:rPr>
-        <w:t xml:space="preserve"> Prends en compte ces directives strictes. Maintenant, [décris ici ce que tu veux qu'il code, par exemple : "génère-moi le tableau de bord propriétaire en appliquant cette charte"]. Respecte scrupuleusement la palette et les formes décrites ci-dessus.</w:t>
+          <w:rFonts w:eastAsia="Times New Roman" w:cs="Times New Roman"/>
+          <w:kern w:val="0"/>
+          <w:lang w:eastAsia="fr-FR"/>
+          <w14:ligatures w14:val="none"/>
+        </w:rPr>
+        <w:t xml:space="preserve"> Prends en compte ces directives strictes. Maintenant,</w:t>
+      </w:r>
+      <w:r>
+        <w:rPr>
+          <w:rFonts w:eastAsia="Times New Roman" w:cs="Times New Roman"/>
+          <w:kern w:val="0"/>
+          <w:lang w:eastAsia="fr-FR"/>
+          <w14:ligatures w14:val="none"/>
+        </w:rPr>
+        <w:t xml:space="preserve"> recode-moi le site pour changer la direction artistique de </w:t>
+      </w:r>
+      <w:proofErr w:type="gramStart"/>
+      <w:r>
+        <w:rPr>
+          <w:rFonts w:eastAsia="Times New Roman" w:cs="Times New Roman"/>
+          <w:kern w:val="0"/>
+          <w:lang w:eastAsia="fr-FR"/>
+          <w14:ligatures w14:val="none"/>
+        </w:rPr>
+        <w:t>tous le site</w:t>
+      </w:r>
+      <w:proofErr w:type="gramEnd"/>
+      <w:r>
+        <w:rPr>
+          <w:rFonts w:eastAsia="Times New Roman" w:cs="Times New Roman"/>
+          <w:kern w:val="0"/>
+          <w:lang w:eastAsia="fr-FR"/>
+          <w14:ligatures w14:val="none"/>
+        </w:rPr>
+        <w:t xml:space="preserve"> entièrement en appliquant celle que je viens de te donner.</w:t>
+      </w:r>
+      <w:r>
+        <w:rPr>
+          <w:rFonts w:eastAsia="Times New Roman" w:cs="Times New Roman"/>
+          <w:kern w:val="0"/>
+          <w:lang w:eastAsia="fr-FR"/>
+          <w14:ligatures w14:val="none"/>
+        </w:rPr>
+        <w:t xml:space="preserve"> Respecte scrupuleusement la palette et les formes décrites ci-dessus.</w:t>
+      </w:r>
+      <w:r>
+        <w:rPr>
+          <w:rFonts w:eastAsia="Times New Roman" w:cs="Times New Roman"/>
+          <w:kern w:val="0"/>
+          <w:lang w:eastAsia="fr-FR"/>
+          <w14:ligatures w14:val="none"/>
+        </w:rPr>
+        <w:t xml:space="preserve"> Merci</w:t>
       </w:r>
     </w:p>
     <w:p/>

</xml_diff>